<commit_message>
docs: refine report architecture reference
</commit_message>
<xml_diff>
--- a/docs/report/DecisionJury_小学期实验报告.docx
+++ b/docs/report/DecisionJury_小学期实验报告.docx
@@ -13564,74 +13564,7 @@
           <w:b w:val="0"/>
           <w:sz w:val="21"/>
         </w:rPr>
-        <w:t>系统由前端、后端主服务、Agent 编排层、RAG 服务、工具模块和 SQLite 数据库组成。前端运行在 5173 端口，只调用后端 REST API；后端运行在 8000 端口，负责业务接口、状态管理、持久化和 Agent 编排；RAG 服务运行在 8001 端口，通过 HTTP 接口提供 BM25 检索；工具模块以 Python 函数和统一 call_tool 入口被编排层调用；大语言模型通过 HTTPS 调用 DeepSeek API，未配置密钥或调用失败时回退到 mock。</w:t>
-      </w:r>
-    </w:p>
-    <w:p>
-      <w:pPr>
-        <w:jc w:val="center"/>
-      </w:pPr>
-      <w:r>
-        <w:drawing>
-          <wp:inline xmlns:a="http://schemas.openxmlformats.org/drawingml/2006/main" xmlns:pic="http://schemas.openxmlformats.org/drawingml/2006/picture">
-            <wp:extent cx="5486400" cy="3840480"/>
-            <wp:docPr id="11" name="Picture 11"/>
-            <wp:cNvGraphicFramePr>
-              <a:graphicFrameLocks noChangeAspect="1"/>
-            </wp:cNvGraphicFramePr>
-            <a:graphic>
-              <a:graphicData uri="http://schemas.openxmlformats.org/drawingml/2006/picture">
-                <pic:pic>
-                  <pic:nvPicPr>
-                    <pic:cNvPr id="0" name="fig_3_1_architecture.png"/>
-                    <pic:cNvPicPr/>
-                  </pic:nvPicPr>
-                  <pic:blipFill>
-                    <a:blip r:embed="rId19"/>
-                    <a:stretch>
-                      <a:fillRect/>
-                    </a:stretch>
-                  </pic:blipFill>
-                  <pic:spPr>
-                    <a:xfrm>
-                      <a:off x="0" y="0"/>
-                      <a:ext cx="5486400" cy="3840480"/>
-                    </a:xfrm>
-                    <a:prstGeom prst="rect"/>
-                  </pic:spPr>
-                </pic:pic>
-              </a:graphicData>
-            </a:graphic>
-          </wp:inline>
-        </w:drawing>
-      </w:r>
-    </w:p>
-    <w:p>
-      <w:pPr>
-        <w:spacing w:after="160"/>
-        <w:jc w:val="center"/>
-      </w:pPr>
-      <w:r>
-        <w:rPr>
-          <w:rFonts w:ascii="Times New Roman" w:hAnsi="Times New Roman" w:eastAsia="宋体"/>
-          <w:b w:val="0"/>
-          <w:sz w:val="18"/>
-        </w:rPr>
-        <w:t>图 4-1 系统总体架构图</w:t>
-      </w:r>
-    </w:p>
-    <w:p>
-      <w:pPr>
-        <w:spacing w:after="120" w:line="360" w:lineRule="auto"/>
-        <w:ind w:firstLine="420"/>
-      </w:pPr>
-      <w:r>
-        <w:rPr>
-          <w:rFonts w:ascii="Times New Roman" w:hAnsi="Times New Roman" w:eastAsia="宋体"/>
-          <w:b w:val="0"/>
-          <w:sz w:val="21"/>
-        </w:rPr>
-        <w:t>图 4-1 系统总体架构图</w:t>
+        <w:t>系统总体架构如图 3-1 所示。前端运行在 5173 端口，只调用后端 REST API；后端运行在 8000 端口，负责业务接口、状态管理、持久化和 Agent 编排；RAG 服务运行在 8001 端口，通过 HTTP 接口提供 BM25 检索；工具模块以 Python 函数和统一 call_tool 入口被编排层调用；大语言模型通过 HTTPS 调用 DeepSeek API，未配置密钥或调用失败时回退到 mock。</w:t>
       </w:r>
     </w:p>
     <w:p>
@@ -19188,7 +19121,7 @@
         <w:drawing>
           <wp:inline xmlns:a="http://schemas.openxmlformats.org/drawingml/2006/main" xmlns:pic="http://schemas.openxmlformats.org/drawingml/2006/picture">
             <wp:extent cx="5486400" cy="3460652"/>
-            <wp:docPr id="12" name="Picture 12"/>
+            <wp:docPr id="11" name="Picture 11"/>
             <wp:cNvGraphicFramePr>
               <a:graphicFrameLocks noChangeAspect="1"/>
             </wp:cNvGraphicFramePr>
@@ -20606,7 +20539,7 @@
         <w:drawing>
           <wp:inline xmlns:a="http://schemas.openxmlformats.org/drawingml/2006/main" xmlns:pic="http://schemas.openxmlformats.org/drawingml/2006/picture">
             <wp:extent cx="5486400" cy="3526971"/>
-            <wp:docPr id="13" name="Picture 13"/>
+            <wp:docPr id="12" name="Picture 12"/>
             <wp:cNvGraphicFramePr>
               <a:graphicFrameLocks noChangeAspect="1"/>
             </wp:cNvGraphicFramePr>

</xml_diff>

<commit_message>
docs: keep template five-size heading convention
</commit_message>
<xml_diff>
--- a/docs/report/DecisionJury_小学期实验报告.docx
+++ b/docs/report/DecisionJury_小学期实验报告.docx
@@ -966,26 +966,26 @@
     </w:p>
     <w:p>
       <w:pPr>
-        <w:spacing w:before="240" w:after="120" w:line="276" w:lineRule="auto"/>
+        <w:spacing w:before="200" w:after="80" w:line="276" w:lineRule="auto"/>
       </w:pPr>
       <w:r>
         <w:rPr>
           <w:rFonts w:ascii="Times New Roman" w:hAnsi="Times New Roman" w:eastAsia="宋体"/>
           <w:b/>
-          <w:sz w:val="30"/>
+          <w:sz w:val="21"/>
         </w:rPr>
         <w:t>00 封面、摘要与引言</w:t>
       </w:r>
     </w:p>
     <w:p>
       <w:pPr>
-        <w:spacing w:before="160" w:after="120" w:line="276" w:lineRule="auto"/>
+        <w:spacing w:before="120" w:after="80" w:line="276" w:lineRule="auto"/>
       </w:pPr>
       <w:r>
         <w:rPr>
           <w:rFonts w:ascii="Times New Roman" w:hAnsi="Times New Roman" w:eastAsia="宋体"/>
           <w:b/>
-          <w:sz w:val="26"/>
+          <w:sz w:val="21"/>
         </w:rPr>
         <w:t>摘要</w:t>
       </w:r>
@@ -1006,13 +1006,13 @@
     </w:p>
     <w:p>
       <w:pPr>
-        <w:spacing w:before="160" w:after="120" w:line="276" w:lineRule="auto"/>
+        <w:spacing w:before="120" w:after="80" w:line="276" w:lineRule="auto"/>
       </w:pPr>
       <w:r>
         <w:rPr>
           <w:rFonts w:ascii="Times New Roman" w:hAnsi="Times New Roman" w:eastAsia="宋体"/>
           <w:b/>
-          <w:sz w:val="26"/>
+          <w:sz w:val="21"/>
         </w:rPr>
         <w:t>关键词</w:t>
       </w:r>
@@ -1033,26 +1033,26 @@
     </w:p>
     <w:p>
       <w:pPr>
-        <w:spacing w:before="160" w:after="120" w:line="276" w:lineRule="auto"/>
+        <w:spacing w:before="120" w:after="80" w:line="276" w:lineRule="auto"/>
       </w:pPr>
       <w:r>
         <w:rPr>
           <w:rFonts w:ascii="Times New Roman" w:hAnsi="Times New Roman" w:eastAsia="宋体"/>
           <w:b/>
-          <w:sz w:val="26"/>
+          <w:sz w:val="21"/>
         </w:rPr>
         <w:t>0 引 言</w:t>
       </w:r>
     </w:p>
     <w:p>
       <w:pPr>
-        <w:spacing w:before="160" w:after="120" w:line="276" w:lineRule="auto"/>
+        <w:spacing w:before="120" w:after="80" w:line="276" w:lineRule="auto"/>
       </w:pPr>
       <w:r>
         <w:rPr>
           <w:rFonts w:ascii="Times New Roman" w:hAnsi="Times New Roman" w:eastAsia="宋体"/>
           <w:b/>
-          <w:sz w:val="23"/>
+          <w:sz w:val="21"/>
         </w:rPr>
         <w:t>0.1 选题背景</w:t>
       </w:r>
@@ -1087,13 +1087,13 @@
     </w:p>
     <w:p>
       <w:pPr>
-        <w:spacing w:before="160" w:after="120" w:line="276" w:lineRule="auto"/>
+        <w:spacing w:before="120" w:after="80" w:line="276" w:lineRule="auto"/>
       </w:pPr>
       <w:r>
         <w:rPr>
           <w:rFonts w:ascii="Times New Roman" w:hAnsi="Times New Roman" w:eastAsia="宋体"/>
           <w:b/>
-          <w:sz w:val="23"/>
+          <w:sz w:val="21"/>
         </w:rPr>
         <w:t>0.2 研究目的与意义</w:t>
       </w:r>
@@ -1128,13 +1128,13 @@
     </w:p>
     <w:p>
       <w:pPr>
-        <w:spacing w:before="160" w:after="120" w:line="276" w:lineRule="auto"/>
+        <w:spacing w:before="120" w:after="80" w:line="276" w:lineRule="auto"/>
       </w:pPr>
       <w:r>
         <w:rPr>
           <w:rFonts w:ascii="Times New Roman" w:hAnsi="Times New Roman" w:eastAsia="宋体"/>
           <w:b/>
-          <w:sz w:val="23"/>
+          <w:sz w:val="21"/>
         </w:rPr>
         <w:t>0.3 项目范围与边界</w:t>
       </w:r>
@@ -1169,13 +1169,13 @@
     </w:p>
     <w:p>
       <w:pPr>
-        <w:spacing w:before="160" w:after="120" w:line="276" w:lineRule="auto"/>
+        <w:spacing w:before="120" w:after="80" w:line="276" w:lineRule="auto"/>
       </w:pPr>
       <w:r>
         <w:rPr>
           <w:rFonts w:ascii="Times New Roman" w:hAnsi="Times New Roman" w:eastAsia="宋体"/>
           <w:b/>
-          <w:sz w:val="23"/>
+          <w:sz w:val="21"/>
         </w:rPr>
         <w:t>0.4 已有工作基础</w:t>
       </w:r>
@@ -1210,13 +1210,13 @@
     </w:p>
     <w:p>
       <w:pPr>
-        <w:spacing w:before="160" w:after="120" w:line="276" w:lineRule="auto"/>
+        <w:spacing w:before="120" w:after="80" w:line="276" w:lineRule="auto"/>
       </w:pPr>
       <w:r>
         <w:rPr>
           <w:rFonts w:ascii="Times New Roman" w:hAnsi="Times New Roman" w:eastAsia="宋体"/>
           <w:b/>
-          <w:sz w:val="23"/>
+          <w:sz w:val="21"/>
         </w:rPr>
         <w:t>0.5 报告组织结构</w:t>
       </w:r>
@@ -1242,26 +1242,26 @@
     </w:p>
     <w:p>
       <w:pPr>
-        <w:spacing w:before="240" w:after="120" w:line="276" w:lineRule="auto"/>
+        <w:spacing w:before="200" w:after="80" w:line="276" w:lineRule="auto"/>
       </w:pPr>
       <w:r>
         <w:rPr>
           <w:rFonts w:ascii="Times New Roman" w:hAnsi="Times New Roman" w:eastAsia="宋体"/>
           <w:b/>
-          <w:sz w:val="30"/>
+          <w:sz w:val="21"/>
         </w:rPr>
         <w:t>01 项目概述</w:t>
       </w:r>
     </w:p>
     <w:p>
       <w:pPr>
-        <w:spacing w:before="160" w:after="120" w:line="276" w:lineRule="auto"/>
+        <w:spacing w:before="120" w:after="80" w:line="276" w:lineRule="auto"/>
       </w:pPr>
       <w:r>
         <w:rPr>
           <w:rFonts w:ascii="Times New Roman" w:hAnsi="Times New Roman" w:eastAsia="宋体"/>
           <w:b/>
-          <w:sz w:val="26"/>
+          <w:sz w:val="21"/>
         </w:rPr>
         <w:t>1.1 项目背景</w:t>
       </w:r>
@@ -1310,13 +1310,13 @@
     </w:p>
     <w:p>
       <w:pPr>
-        <w:spacing w:before="160" w:after="120" w:line="276" w:lineRule="auto"/>
+        <w:spacing w:before="120" w:after="80" w:line="276" w:lineRule="auto"/>
       </w:pPr>
       <w:r>
         <w:rPr>
           <w:rFonts w:ascii="Times New Roman" w:hAnsi="Times New Roman" w:eastAsia="宋体"/>
           <w:b/>
-          <w:sz w:val="26"/>
+          <w:sz w:val="21"/>
         </w:rPr>
         <w:t>1.2 项目简介</w:t>
       </w:r>
@@ -1365,13 +1365,13 @@
     </w:p>
     <w:p>
       <w:pPr>
-        <w:spacing w:before="160" w:after="120" w:line="276" w:lineRule="auto"/>
+        <w:spacing w:before="120" w:after="80" w:line="276" w:lineRule="auto"/>
       </w:pPr>
       <w:r>
         <w:rPr>
           <w:rFonts w:ascii="Times New Roman" w:hAnsi="Times New Roman" w:eastAsia="宋体"/>
           <w:b/>
-          <w:sz w:val="26"/>
+          <w:sz w:val="21"/>
         </w:rPr>
         <w:t>1.3 项目计划</w:t>
       </w:r>
@@ -1748,13 +1748,13 @@
     </w:p>
     <w:p>
       <w:pPr>
-        <w:spacing w:before="160" w:after="120" w:line="276" w:lineRule="auto"/>
+        <w:spacing w:before="120" w:after="80" w:line="276" w:lineRule="auto"/>
       </w:pPr>
       <w:r>
         <w:rPr>
           <w:rFonts w:ascii="Times New Roman" w:hAnsi="Times New Roman" w:eastAsia="宋体"/>
           <w:b/>
-          <w:sz w:val="26"/>
+          <w:sz w:val="21"/>
         </w:rPr>
         <w:t>1.4 团队分工</w:t>
       </w:r>
@@ -2273,26 +2273,26 @@
     </w:p>
     <w:p>
       <w:pPr>
-        <w:spacing w:before="160" w:after="120" w:line="276" w:lineRule="auto"/>
+        <w:spacing w:before="120" w:after="80" w:line="276" w:lineRule="auto"/>
       </w:pPr>
       <w:r>
         <w:rPr>
           <w:rFonts w:ascii="Times New Roman" w:hAnsi="Times New Roman" w:eastAsia="宋体"/>
           <w:b/>
-          <w:sz w:val="26"/>
+          <w:sz w:val="21"/>
         </w:rPr>
         <w:t>1.5 项目范围与边界</w:t>
       </w:r>
     </w:p>
     <w:p>
       <w:pPr>
-        <w:spacing w:before="160" w:after="120" w:line="276" w:lineRule="auto"/>
+        <w:spacing w:before="120" w:after="80" w:line="276" w:lineRule="auto"/>
       </w:pPr>
       <w:r>
         <w:rPr>
           <w:rFonts w:ascii="Times New Roman" w:hAnsi="Times New Roman" w:eastAsia="宋体"/>
           <w:b/>
-          <w:sz w:val="23"/>
+          <w:sz w:val="21"/>
         </w:rPr>
         <w:t>1.5.1 本轮交付范围</w:t>
       </w:r>
@@ -2397,13 +2397,13 @@
     </w:p>
     <w:p>
       <w:pPr>
-        <w:spacing w:before="160" w:after="120" w:line="276" w:lineRule="auto"/>
+        <w:spacing w:before="120" w:after="80" w:line="276" w:lineRule="auto"/>
       </w:pPr>
       <w:r>
         <w:rPr>
           <w:rFonts w:ascii="Times New Roman" w:hAnsi="Times New Roman" w:eastAsia="宋体"/>
           <w:b/>
-          <w:sz w:val="23"/>
+          <w:sz w:val="21"/>
         </w:rPr>
         <w:t>1.5.2 不纳入本轮范围</w:t>
       </w:r>
@@ -2480,13 +2480,13 @@
     </w:p>
     <w:p>
       <w:pPr>
-        <w:spacing w:before="160" w:after="120" w:line="276" w:lineRule="auto"/>
+        <w:spacing w:before="120" w:after="80" w:line="276" w:lineRule="auto"/>
       </w:pPr>
       <w:r>
         <w:rPr>
           <w:rFonts w:ascii="Times New Roman" w:hAnsi="Times New Roman" w:eastAsia="宋体"/>
           <w:b/>
-          <w:sz w:val="23"/>
+          <w:sz w:val="21"/>
         </w:rPr>
         <w:t>1.5.3 输出边界</w:t>
       </w:r>
@@ -2507,13 +2507,13 @@
     </w:p>
     <w:p>
       <w:pPr>
-        <w:spacing w:before="160" w:after="120" w:line="276" w:lineRule="auto"/>
+        <w:spacing w:before="120" w:after="80" w:line="276" w:lineRule="auto"/>
       </w:pPr>
       <w:r>
         <w:rPr>
           <w:rFonts w:ascii="Times New Roman" w:hAnsi="Times New Roman" w:eastAsia="宋体"/>
           <w:b/>
-          <w:sz w:val="26"/>
+          <w:sz w:val="21"/>
         </w:rPr>
         <w:t>1.6 技术选型</w:t>
       </w:r>
@@ -3025,39 +3025,39 @@
     </w:p>
     <w:p>
       <w:pPr>
-        <w:spacing w:before="240" w:after="120" w:line="276" w:lineRule="auto"/>
+        <w:spacing w:before="200" w:after="80" w:line="276" w:lineRule="auto"/>
       </w:pPr>
       <w:r>
         <w:rPr>
           <w:rFonts w:ascii="Times New Roman" w:hAnsi="Times New Roman" w:eastAsia="宋体"/>
           <w:b/>
-          <w:sz w:val="30"/>
+          <w:sz w:val="21"/>
         </w:rPr>
         <w:t>02 需求分析</w:t>
       </w:r>
     </w:p>
     <w:p>
       <w:pPr>
-        <w:spacing w:before="160" w:after="120" w:line="276" w:lineRule="auto"/>
+        <w:spacing w:before="120" w:after="80" w:line="276" w:lineRule="auto"/>
       </w:pPr>
       <w:r>
         <w:rPr>
           <w:rFonts w:ascii="Times New Roman" w:hAnsi="Times New Roman" w:eastAsia="宋体"/>
           <w:b/>
-          <w:sz w:val="26"/>
+          <w:sz w:val="21"/>
         </w:rPr>
         <w:t>2.1 用户角色与使用场景</w:t>
       </w:r>
     </w:p>
     <w:p>
       <w:pPr>
-        <w:spacing w:before="160" w:after="120" w:line="276" w:lineRule="auto"/>
+        <w:spacing w:before="120" w:after="80" w:line="276" w:lineRule="auto"/>
       </w:pPr>
       <w:r>
         <w:rPr>
           <w:rFonts w:ascii="Times New Roman" w:hAnsi="Times New Roman" w:eastAsia="宋体"/>
           <w:b/>
-          <w:sz w:val="23"/>
+          <w:sz w:val="21"/>
         </w:rPr>
         <w:t>2.1.1 用户角色</w:t>
       </w:r>
@@ -3328,13 +3328,13 @@
     </w:p>
     <w:p>
       <w:pPr>
-        <w:spacing w:before="160" w:after="120" w:line="276" w:lineRule="auto"/>
+        <w:spacing w:before="120" w:after="80" w:line="276" w:lineRule="auto"/>
       </w:pPr>
       <w:r>
         <w:rPr>
           <w:rFonts w:ascii="Times New Roman" w:hAnsi="Times New Roman" w:eastAsia="宋体"/>
           <w:b/>
-          <w:sz w:val="23"/>
+          <w:sz w:val="21"/>
         </w:rPr>
         <w:t>2.1.2 典型使用场景</w:t>
       </w:r>
@@ -3369,26 +3369,26 @@
     </w:p>
     <w:p>
       <w:pPr>
-        <w:spacing w:before="160" w:after="120" w:line="276" w:lineRule="auto"/>
+        <w:spacing w:before="120" w:after="80" w:line="276" w:lineRule="auto"/>
       </w:pPr>
       <w:r>
         <w:rPr>
           <w:rFonts w:ascii="Times New Roman" w:hAnsi="Times New Roman" w:eastAsia="宋体"/>
           <w:b/>
-          <w:sz w:val="26"/>
+          <w:sz w:val="21"/>
         </w:rPr>
         <w:t>2.2 功能需求</w:t>
       </w:r>
     </w:p>
     <w:p>
       <w:pPr>
-        <w:spacing w:before="160" w:after="120" w:line="276" w:lineRule="auto"/>
+        <w:spacing w:before="120" w:after="80" w:line="276" w:lineRule="auto"/>
       </w:pPr>
       <w:r>
         <w:rPr>
           <w:rFonts w:ascii="Times New Roman" w:hAnsi="Times New Roman" w:eastAsia="宋体"/>
           <w:b/>
-          <w:sz w:val="23"/>
+          <w:sz w:val="21"/>
         </w:rPr>
         <w:t>2.2.1 基本功能需求</w:t>
       </w:r>
@@ -4751,13 +4751,13 @@
     </w:p>
     <w:p>
       <w:pPr>
-        <w:spacing w:before="160" w:after="120" w:line="276" w:lineRule="auto"/>
+        <w:spacing w:before="120" w:after="80" w:line="276" w:lineRule="auto"/>
       </w:pPr>
       <w:r>
         <w:rPr>
           <w:rFonts w:ascii="Times New Roman" w:hAnsi="Times New Roman" w:eastAsia="宋体"/>
           <w:b/>
-          <w:sz w:val="23"/>
+          <w:sz w:val="21"/>
         </w:rPr>
         <w:t>2.2.2 拓展功能需求</w:t>
       </w:r>
@@ -5340,13 +5340,13 @@
     </w:p>
     <w:p>
       <w:pPr>
-        <w:spacing w:before="160" w:after="120" w:line="276" w:lineRule="auto"/>
+        <w:spacing w:before="120" w:after="80" w:line="276" w:lineRule="auto"/>
       </w:pPr>
       <w:r>
         <w:rPr>
           <w:rFonts w:ascii="Times New Roman" w:hAnsi="Times New Roman" w:eastAsia="宋体"/>
           <w:b/>
-          <w:sz w:val="23"/>
+          <w:sz w:val="21"/>
         </w:rPr>
         <w:t>2.2.3 信息收集字段</w:t>
       </w:r>
@@ -5367,13 +5367,13 @@
     </w:p>
     <w:p>
       <w:pPr>
-        <w:spacing w:before="160" w:after="120" w:line="276" w:lineRule="auto"/>
+        <w:spacing w:before="120" w:after="80" w:line="276" w:lineRule="auto"/>
       </w:pPr>
       <w:r>
         <w:rPr>
           <w:rFonts w:ascii="Times New Roman" w:hAnsi="Times New Roman" w:eastAsia="宋体"/>
           <w:b/>
-          <w:sz w:val="23"/>
+          <w:sz w:val="21"/>
         </w:rPr>
         <w:t>2.2.4 业务流程</w:t>
       </w:r>
@@ -5454,13 +5454,13 @@
     </w:p>
     <w:p>
       <w:pPr>
-        <w:spacing w:before="160" w:after="120" w:line="276" w:lineRule="auto"/>
+        <w:spacing w:before="120" w:after="80" w:line="276" w:lineRule="auto"/>
       </w:pPr>
       <w:r>
         <w:rPr>
           <w:rFonts w:ascii="Times New Roman" w:hAnsi="Times New Roman" w:eastAsia="宋体"/>
           <w:b/>
-          <w:sz w:val="23"/>
+          <w:sz w:val="21"/>
         </w:rPr>
         <w:t>2.2.5 输入边界与拒绝策略</w:t>
       </w:r>
@@ -5773,26 +5773,26 @@
     </w:p>
     <w:p>
       <w:pPr>
-        <w:spacing w:before="160" w:after="120" w:line="276" w:lineRule="auto"/>
+        <w:spacing w:before="120" w:after="80" w:line="276" w:lineRule="auto"/>
       </w:pPr>
       <w:r>
         <w:rPr>
           <w:rFonts w:ascii="Times New Roman" w:hAnsi="Times New Roman" w:eastAsia="宋体"/>
           <w:b/>
-          <w:sz w:val="26"/>
+          <w:sz w:val="21"/>
         </w:rPr>
         <w:t>2.3 非功能需求</w:t>
       </w:r>
     </w:p>
     <w:p>
       <w:pPr>
-        <w:spacing w:before="160" w:after="120" w:line="276" w:lineRule="auto"/>
+        <w:spacing w:before="120" w:after="80" w:line="276" w:lineRule="auto"/>
       </w:pPr>
       <w:r>
         <w:rPr>
           <w:rFonts w:ascii="Times New Roman" w:hAnsi="Times New Roman" w:eastAsia="宋体"/>
           <w:b/>
-          <w:sz w:val="23"/>
+          <w:sz w:val="21"/>
         </w:rPr>
         <w:t>2.3.1 性能需求</w:t>
       </w:r>
@@ -5841,13 +5841,13 @@
     </w:p>
     <w:p>
       <w:pPr>
-        <w:spacing w:before="160" w:after="120" w:line="276" w:lineRule="auto"/>
+        <w:spacing w:before="120" w:after="80" w:line="276" w:lineRule="auto"/>
       </w:pPr>
       <w:r>
         <w:rPr>
           <w:rFonts w:ascii="Times New Roman" w:hAnsi="Times New Roman" w:eastAsia="宋体"/>
           <w:b/>
-          <w:sz w:val="23"/>
+          <w:sz w:val="21"/>
         </w:rPr>
         <w:t>2.3.2 可解释性需求</w:t>
       </w:r>
@@ -5910,13 +5910,13 @@
     </w:p>
     <w:p>
       <w:pPr>
-        <w:spacing w:before="160" w:after="120" w:line="276" w:lineRule="auto"/>
+        <w:spacing w:before="120" w:after="80" w:line="276" w:lineRule="auto"/>
       </w:pPr>
       <w:r>
         <w:rPr>
           <w:rFonts w:ascii="Times New Roman" w:hAnsi="Times New Roman" w:eastAsia="宋体"/>
           <w:b/>
-          <w:sz w:val="23"/>
+          <w:sz w:val="21"/>
         </w:rPr>
         <w:t>2.3.3 可靠性与异常处理需求</w:t>
       </w:r>
@@ -5979,13 +5979,13 @@
     </w:p>
     <w:p>
       <w:pPr>
-        <w:spacing w:before="160" w:after="120" w:line="276" w:lineRule="auto"/>
+        <w:spacing w:before="120" w:after="80" w:line="276" w:lineRule="auto"/>
       </w:pPr>
       <w:r>
         <w:rPr>
           <w:rFonts w:ascii="Times New Roman" w:hAnsi="Times New Roman" w:eastAsia="宋体"/>
           <w:b/>
-          <w:sz w:val="23"/>
+          <w:sz w:val="21"/>
         </w:rPr>
         <w:t>2.3.4 安全性需求</w:t>
       </w:r>
@@ -6048,13 +6048,13 @@
     </w:p>
     <w:p>
       <w:pPr>
-        <w:spacing w:before="160" w:after="120" w:line="276" w:lineRule="auto"/>
+        <w:spacing w:before="120" w:after="80" w:line="276" w:lineRule="auto"/>
       </w:pPr>
       <w:r>
         <w:rPr>
           <w:rFonts w:ascii="Times New Roman" w:hAnsi="Times New Roman" w:eastAsia="宋体"/>
           <w:b/>
-          <w:sz w:val="23"/>
+          <w:sz w:val="21"/>
         </w:rPr>
         <w:t>2.3.5 可维护性与可扩展性需求</w:t>
       </w:r>
@@ -6117,13 +6117,13 @@
     </w:p>
     <w:p>
       <w:pPr>
-        <w:spacing w:before="160" w:after="120" w:line="276" w:lineRule="auto"/>
+        <w:spacing w:before="120" w:after="80" w:line="276" w:lineRule="auto"/>
       </w:pPr>
       <w:r>
         <w:rPr>
           <w:rFonts w:ascii="Times New Roman" w:hAnsi="Times New Roman" w:eastAsia="宋体"/>
           <w:b/>
-          <w:sz w:val="23"/>
+          <w:sz w:val="21"/>
         </w:rPr>
         <w:t>2.3.6 可演示性需求</w:t>
       </w:r>
@@ -6186,13 +6186,13 @@
     </w:p>
     <w:p>
       <w:pPr>
-        <w:spacing w:before="160" w:after="120" w:line="276" w:lineRule="auto"/>
+        <w:spacing w:before="120" w:after="80" w:line="276" w:lineRule="auto"/>
       </w:pPr>
       <w:r>
         <w:rPr>
           <w:rFonts w:ascii="Times New Roman" w:hAnsi="Times New Roman" w:eastAsia="宋体"/>
           <w:b/>
-          <w:sz w:val="26"/>
+          <w:sz w:val="21"/>
         </w:rPr>
         <w:t>2.4 需求优先级</w:t>
       </w:r>
@@ -7112,13 +7112,13 @@
     </w:p>
     <w:p>
       <w:pPr>
-        <w:spacing w:before="160" w:after="120" w:line="276" w:lineRule="auto"/>
+        <w:spacing w:before="120" w:after="80" w:line="276" w:lineRule="auto"/>
       </w:pPr>
       <w:r>
         <w:rPr>
           <w:rFonts w:ascii="Times New Roman" w:hAnsi="Times New Roman" w:eastAsia="宋体"/>
           <w:b/>
-          <w:sz w:val="26"/>
+          <w:sz w:val="21"/>
         </w:rPr>
         <w:t>2.5 验收标准</w:t>
       </w:r>
@@ -7228,39 +7228,39 @@
     </w:p>
     <w:p>
       <w:pPr>
-        <w:spacing w:before="240" w:after="120" w:line="276" w:lineRule="auto"/>
+        <w:spacing w:before="200" w:after="80" w:line="276" w:lineRule="auto"/>
       </w:pPr>
       <w:r>
         <w:rPr>
           <w:rFonts w:ascii="Times New Roman" w:hAnsi="Times New Roman" w:eastAsia="宋体"/>
           <w:b/>
-          <w:sz w:val="30"/>
+          <w:sz w:val="21"/>
         </w:rPr>
         <w:t>03 设计方案</w:t>
       </w:r>
     </w:p>
     <w:p>
       <w:pPr>
-        <w:spacing w:before="160" w:after="120" w:line="276" w:lineRule="auto"/>
+        <w:spacing w:before="120" w:after="80" w:line="276" w:lineRule="auto"/>
       </w:pPr>
       <w:r>
         <w:rPr>
           <w:rFonts w:ascii="Times New Roman" w:hAnsi="Times New Roman" w:eastAsia="宋体"/>
           <w:b/>
-          <w:sz w:val="26"/>
+          <w:sz w:val="21"/>
         </w:rPr>
         <w:t>3.1 数据描述</w:t>
       </w:r>
     </w:p>
     <w:p>
       <w:pPr>
-        <w:spacing w:before="160" w:after="120" w:line="276" w:lineRule="auto"/>
+        <w:spacing w:before="120" w:after="80" w:line="276" w:lineRule="auto"/>
       </w:pPr>
       <w:r>
         <w:rPr>
           <w:rFonts w:ascii="Times New Roman" w:hAnsi="Times New Roman" w:eastAsia="宋体"/>
           <w:b/>
-          <w:sz w:val="23"/>
+          <w:sz w:val="21"/>
         </w:rPr>
         <w:t>3.1.1 数据存储总体设计</w:t>
       </w:r>
@@ -7854,13 +7854,13 @@
     </w:p>
     <w:p>
       <w:pPr>
-        <w:spacing w:before="160" w:after="120" w:line="276" w:lineRule="auto"/>
+        <w:spacing w:before="120" w:after="80" w:line="276" w:lineRule="auto"/>
       </w:pPr>
       <w:r>
         <w:rPr>
           <w:rFonts w:ascii="Times New Roman" w:hAnsi="Times New Roman" w:eastAsia="宋体"/>
           <w:b/>
-          <w:sz w:val="23"/>
+          <w:sz w:val="21"/>
         </w:rPr>
         <w:t>3.1.2 核心数据结构</w:t>
       </w:r>
@@ -8485,13 +8485,13 @@
     </w:p>
     <w:p>
       <w:pPr>
-        <w:spacing w:before="160" w:after="120" w:line="276" w:lineRule="auto"/>
+        <w:spacing w:before="120" w:after="80" w:line="276" w:lineRule="auto"/>
       </w:pPr>
       <w:r>
         <w:rPr>
           <w:rFonts w:ascii="Times New Roman" w:hAnsi="Times New Roman" w:eastAsia="宋体"/>
           <w:b/>
-          <w:sz w:val="23"/>
+          <w:sz w:val="21"/>
         </w:rPr>
         <w:t>3.1.3 案件状态设计</w:t>
       </w:r>
@@ -8593,26 +8593,26 @@
     </w:p>
     <w:p>
       <w:pPr>
-        <w:spacing w:before="160" w:after="120" w:line="276" w:lineRule="auto"/>
+        <w:spacing w:before="120" w:after="80" w:line="276" w:lineRule="auto"/>
       </w:pPr>
       <w:r>
         <w:rPr>
           <w:rFonts w:ascii="Times New Roman" w:hAnsi="Times New Roman" w:eastAsia="宋体"/>
           <w:b/>
-          <w:sz w:val="26"/>
+          <w:sz w:val="21"/>
         </w:rPr>
         <w:t>3.2 功能设计</w:t>
       </w:r>
     </w:p>
     <w:p>
       <w:pPr>
-        <w:spacing w:before="160" w:after="120" w:line="276" w:lineRule="auto"/>
+        <w:spacing w:before="120" w:after="80" w:line="276" w:lineRule="auto"/>
       </w:pPr>
       <w:r>
         <w:rPr>
           <w:rFonts w:ascii="Times New Roman" w:hAnsi="Times New Roman" w:eastAsia="宋体"/>
           <w:b/>
-          <w:sz w:val="23"/>
+          <w:sz w:val="21"/>
         </w:rPr>
         <w:t>3.2.1 系统总体架构</w:t>
       </w:r>
@@ -8700,13 +8700,13 @@
     </w:p>
     <w:p>
       <w:pPr>
-        <w:spacing w:before="160" w:after="120" w:line="276" w:lineRule="auto"/>
+        <w:spacing w:before="120" w:after="80" w:line="276" w:lineRule="auto"/>
       </w:pPr>
       <w:r>
         <w:rPr>
           <w:rFonts w:ascii="Times New Roman" w:hAnsi="Times New Roman" w:eastAsia="宋体"/>
           <w:b/>
-          <w:sz w:val="23"/>
+          <w:sz w:val="21"/>
         </w:rPr>
         <w:t>3.2.2 模块职责设计</w:t>
       </w:r>
@@ -9095,13 +9095,13 @@
     </w:p>
     <w:p>
       <w:pPr>
-        <w:spacing w:before="160" w:after="120" w:line="276" w:lineRule="auto"/>
+        <w:spacing w:before="120" w:after="80" w:line="276" w:lineRule="auto"/>
       </w:pPr>
       <w:r>
         <w:rPr>
           <w:rFonts w:ascii="Times New Roman" w:hAnsi="Times New Roman" w:eastAsia="宋体"/>
           <w:b/>
-          <w:sz w:val="23"/>
+          <w:sz w:val="21"/>
         </w:rPr>
         <w:t>3.2.3 接口设计</w:t>
       </w:r>
@@ -11385,13 +11385,13 @@
     </w:p>
     <w:p>
       <w:pPr>
-        <w:spacing w:before="160" w:after="120" w:line="276" w:lineRule="auto"/>
+        <w:spacing w:before="120" w:after="80" w:line="276" w:lineRule="auto"/>
       </w:pPr>
       <w:r>
         <w:rPr>
           <w:rFonts w:ascii="Times New Roman" w:hAnsi="Times New Roman" w:eastAsia="宋体"/>
           <w:b/>
-          <w:sz w:val="23"/>
+          <w:sz w:val="21"/>
         </w:rPr>
         <w:t>3.2.4 前端页面设计</w:t>
       </w:r>
@@ -11957,26 +11957,26 @@
     </w:p>
     <w:p>
       <w:pPr>
-        <w:spacing w:before="160" w:after="120" w:line="276" w:lineRule="auto"/>
+        <w:spacing w:before="120" w:after="80" w:line="276" w:lineRule="auto"/>
       </w:pPr>
       <w:r>
         <w:rPr>
           <w:rFonts w:ascii="Times New Roman" w:hAnsi="Times New Roman" w:eastAsia="宋体"/>
           <w:b/>
-          <w:sz w:val="26"/>
+          <w:sz w:val="21"/>
         </w:rPr>
         <w:t>3.3 关键算法说明</w:t>
       </w:r>
     </w:p>
     <w:p>
       <w:pPr>
-        <w:spacing w:before="160" w:after="120" w:line="276" w:lineRule="auto"/>
+        <w:spacing w:before="120" w:after="80" w:line="276" w:lineRule="auto"/>
       </w:pPr>
       <w:r>
         <w:rPr>
           <w:rFonts w:ascii="Times New Roman" w:hAnsi="Times New Roman" w:eastAsia="宋体"/>
           <w:b/>
-          <w:sz w:val="23"/>
+          <w:sz w:val="21"/>
         </w:rPr>
         <w:t>3.3.1 输入解析与字段合并算法</w:t>
       </w:r>
@@ -12081,13 +12081,13 @@
     </w:p>
     <w:p>
       <w:pPr>
-        <w:spacing w:before="160" w:after="120" w:line="276" w:lineRule="auto"/>
+        <w:spacing w:before="120" w:after="80" w:line="276" w:lineRule="auto"/>
       </w:pPr>
       <w:r>
         <w:rPr>
           <w:rFonts w:ascii="Times New Roman" w:hAnsi="Times New Roman" w:eastAsia="宋体"/>
           <w:b/>
-          <w:sz w:val="23"/>
+          <w:sz w:val="21"/>
         </w:rPr>
         <w:t>3.3.2 多 Agent 编排算法</w:t>
       </w:r>
@@ -12343,13 +12343,13 @@
     </w:p>
     <w:p>
       <w:pPr>
-        <w:spacing w:before="160" w:after="120" w:line="276" w:lineRule="auto"/>
+        <w:spacing w:before="120" w:after="80" w:line="276" w:lineRule="auto"/>
       </w:pPr>
       <w:r>
         <w:rPr>
           <w:rFonts w:ascii="Times New Roman" w:hAnsi="Times New Roman" w:eastAsia="宋体"/>
           <w:b/>
-          <w:sz w:val="23"/>
+          <w:sz w:val="21"/>
         </w:rPr>
         <w:t>3.3.3 RAG 检索算法</w:t>
       </w:r>
@@ -12496,13 +12496,13 @@
     </w:p>
     <w:p>
       <w:pPr>
-        <w:spacing w:before="160" w:after="120" w:line="276" w:lineRule="auto"/>
+        <w:spacing w:before="120" w:after="80" w:line="276" w:lineRule="auto"/>
       </w:pPr>
       <w:r>
         <w:rPr>
           <w:rFonts w:ascii="Times New Roman" w:hAnsi="Times New Roman" w:eastAsia="宋体"/>
           <w:b/>
-          <w:sz w:val="23"/>
+          <w:sz w:val="21"/>
         </w:rPr>
         <w:t>3.3.4 成本分析算法</w:t>
       </w:r>
@@ -12751,13 +12751,13 @@
     </w:p>
     <w:p>
       <w:pPr>
-        <w:spacing w:before="160" w:after="120" w:line="276" w:lineRule="auto"/>
+        <w:spacing w:before="120" w:after="80" w:line="276" w:lineRule="auto"/>
       </w:pPr>
       <w:r>
         <w:rPr>
           <w:rFonts w:ascii="Times New Roman" w:hAnsi="Times New Roman" w:eastAsia="宋体"/>
           <w:b/>
-          <w:sz w:val="23"/>
+          <w:sz w:val="21"/>
         </w:rPr>
         <w:t>3.3.5 决策评分算法</w:t>
       </w:r>
@@ -12890,13 +12890,13 @@
     </w:p>
     <w:p>
       <w:pPr>
-        <w:spacing w:before="160" w:after="120" w:line="276" w:lineRule="auto"/>
+        <w:spacing w:before="120" w:after="80" w:line="276" w:lineRule="auto"/>
       </w:pPr>
       <w:r>
         <w:rPr>
           <w:rFonts w:ascii="Times New Roman" w:hAnsi="Times New Roman" w:eastAsia="宋体"/>
           <w:b/>
-          <w:sz w:val="23"/>
+          <w:sz w:val="21"/>
         </w:rPr>
         <w:t>3.3.6 法官裁决算法</w:t>
       </w:r>
@@ -13001,13 +13001,13 @@
     </w:p>
     <w:p>
       <w:pPr>
-        <w:spacing w:before="160" w:after="120" w:line="276" w:lineRule="auto"/>
+        <w:spacing w:before="120" w:after="80" w:line="276" w:lineRule="auto"/>
       </w:pPr>
       <w:r>
         <w:rPr>
           <w:rFonts w:ascii="Times New Roman" w:hAnsi="Times New Roman" w:eastAsia="宋体"/>
           <w:b/>
-          <w:sz w:val="23"/>
+          <w:sz w:val="21"/>
         </w:rPr>
         <w:t>3.3.7 冷静期提醒算法</w:t>
       </w:r>
@@ -13028,26 +13028,26 @@
     </w:p>
     <w:p>
       <w:pPr>
-        <w:spacing w:before="160" w:after="120" w:line="276" w:lineRule="auto"/>
+        <w:spacing w:before="120" w:after="80" w:line="276" w:lineRule="auto"/>
       </w:pPr>
       <w:r>
         <w:rPr>
           <w:rFonts w:ascii="Times New Roman" w:hAnsi="Times New Roman" w:eastAsia="宋体"/>
           <w:b/>
-          <w:sz w:val="26"/>
+          <w:sz w:val="21"/>
         </w:rPr>
         <w:t>3.4 原型图设计</w:t>
       </w:r>
     </w:p>
     <w:p>
       <w:pPr>
-        <w:spacing w:before="160" w:after="120" w:line="276" w:lineRule="auto"/>
+        <w:spacing w:before="120" w:after="80" w:line="276" w:lineRule="auto"/>
       </w:pPr>
       <w:r>
         <w:rPr>
           <w:rFonts w:ascii="Times New Roman" w:hAnsi="Times New Roman" w:eastAsia="宋体"/>
           <w:b/>
-          <w:sz w:val="23"/>
+          <w:sz w:val="21"/>
         </w:rPr>
         <w:t>3.4.1 登录与注册页面</w:t>
       </w:r>
@@ -13135,13 +13135,13 @@
     </w:p>
     <w:p>
       <w:pPr>
-        <w:spacing w:before="160" w:after="120" w:line="276" w:lineRule="auto"/>
+        <w:spacing w:before="120" w:after="80" w:line="276" w:lineRule="auto"/>
       </w:pPr>
       <w:r>
         <w:rPr>
           <w:rFonts w:ascii="Times New Roman" w:hAnsi="Times New Roman" w:eastAsia="宋体"/>
           <w:b/>
-          <w:sz w:val="23"/>
+          <w:sz w:val="21"/>
         </w:rPr>
         <w:t>3.4.2 案件创建页面</w:t>
       </w:r>
@@ -13229,13 +13229,13 @@
     </w:p>
     <w:p>
       <w:pPr>
-        <w:spacing w:before="160" w:after="120" w:line="276" w:lineRule="auto"/>
+        <w:spacing w:before="120" w:after="80" w:line="276" w:lineRule="auto"/>
       </w:pPr>
       <w:r>
         <w:rPr>
           <w:rFonts w:ascii="Times New Roman" w:hAnsi="Times New Roman" w:eastAsia="宋体"/>
           <w:b/>
-          <w:sz w:val="23"/>
+          <w:sz w:val="21"/>
         </w:rPr>
         <w:t>3.4.3 多轮对话页面</w:t>
       </w:r>
@@ -13323,13 +13323,13 @@
     </w:p>
     <w:p>
       <w:pPr>
-        <w:spacing w:before="160" w:after="120" w:line="276" w:lineRule="auto"/>
+        <w:spacing w:before="120" w:after="80" w:line="276" w:lineRule="auto"/>
       </w:pPr>
       <w:r>
         <w:rPr>
           <w:rFonts w:ascii="Times New Roman" w:hAnsi="Times New Roman" w:eastAsia="宋体"/>
           <w:b/>
-          <w:sz w:val="23"/>
+          <w:sz w:val="21"/>
         </w:rPr>
         <w:t>3.4.4 庭审回放与判决书页面</w:t>
       </w:r>
@@ -13417,13 +13417,13 @@
     </w:p>
     <w:p>
       <w:pPr>
-        <w:spacing w:before="160" w:after="120" w:line="276" w:lineRule="auto"/>
+        <w:spacing w:before="120" w:after="80" w:line="276" w:lineRule="auto"/>
       </w:pPr>
       <w:r>
         <w:rPr>
           <w:rFonts w:ascii="Times New Roman" w:hAnsi="Times New Roman" w:eastAsia="宋体"/>
           <w:b/>
-          <w:sz w:val="23"/>
+          <w:sz w:val="21"/>
         </w:rPr>
         <w:t>3.4.5 历史记录与观察清单页面</w:t>
       </w:r>
@@ -13516,39 +13516,39 @@
     </w:p>
     <w:p>
       <w:pPr>
-        <w:spacing w:before="240" w:after="120" w:line="276" w:lineRule="auto"/>
+        <w:spacing w:before="200" w:after="80" w:line="276" w:lineRule="auto"/>
       </w:pPr>
       <w:r>
         <w:rPr>
           <w:rFonts w:ascii="Times New Roman" w:hAnsi="Times New Roman" w:eastAsia="宋体"/>
           <w:b/>
-          <w:sz w:val="30"/>
+          <w:sz w:val="21"/>
         </w:rPr>
         <w:t>04 项目实现</w:t>
       </w:r>
     </w:p>
     <w:p>
       <w:pPr>
-        <w:spacing w:before="160" w:after="120" w:line="276" w:lineRule="auto"/>
+        <w:spacing w:before="120" w:after="80" w:line="276" w:lineRule="auto"/>
       </w:pPr>
       <w:r>
         <w:rPr>
           <w:rFonts w:ascii="Times New Roman" w:hAnsi="Times New Roman" w:eastAsia="宋体"/>
           <w:b/>
-          <w:sz w:val="26"/>
+          <w:sz w:val="21"/>
         </w:rPr>
         <w:t>4.1 总体实现</w:t>
       </w:r>
     </w:p>
     <w:p>
       <w:pPr>
-        <w:spacing w:before="160" w:after="120" w:line="276" w:lineRule="auto"/>
+        <w:spacing w:before="120" w:after="80" w:line="276" w:lineRule="auto"/>
       </w:pPr>
       <w:r>
         <w:rPr>
           <w:rFonts w:ascii="Times New Roman" w:hAnsi="Times New Roman" w:eastAsia="宋体"/>
           <w:b/>
-          <w:sz w:val="23"/>
+          <w:sz w:val="21"/>
         </w:rPr>
         <w:t>4.1.1 系统总体架构</w:t>
       </w:r>
@@ -13569,13 +13569,13 @@
     </w:p>
     <w:p>
       <w:pPr>
-        <w:spacing w:before="160" w:after="120" w:line="276" w:lineRule="auto"/>
+        <w:spacing w:before="120" w:after="80" w:line="276" w:lineRule="auto"/>
       </w:pPr>
       <w:r>
         <w:rPr>
           <w:rFonts w:ascii="Times New Roman" w:hAnsi="Times New Roman" w:eastAsia="宋体"/>
           <w:b/>
-          <w:sz w:val="23"/>
+          <w:sz w:val="21"/>
         </w:rPr>
         <w:t>4.1.2 项目目录结构</w:t>
       </w:r>
@@ -14377,13 +14377,13 @@
     </w:p>
     <w:p>
       <w:pPr>
-        <w:spacing w:before="160" w:after="120" w:line="276" w:lineRule="auto"/>
+        <w:spacing w:before="120" w:after="80" w:line="276" w:lineRule="auto"/>
       </w:pPr>
       <w:r>
         <w:rPr>
           <w:rFonts w:ascii="Times New Roman" w:hAnsi="Times New Roman" w:eastAsia="宋体"/>
           <w:b/>
-          <w:sz w:val="23"/>
+          <w:sz w:val="21"/>
         </w:rPr>
         <w:t>4.1.3 后端实现</w:t>
       </w:r>
@@ -14977,13 +14977,13 @@
     </w:p>
     <w:p>
       <w:pPr>
-        <w:spacing w:before="160" w:after="120" w:line="276" w:lineRule="auto"/>
+        <w:spacing w:before="120" w:after="80" w:line="276" w:lineRule="auto"/>
       </w:pPr>
       <w:r>
         <w:rPr>
           <w:rFonts w:ascii="Times New Roman" w:hAnsi="Times New Roman" w:eastAsia="宋体"/>
           <w:b/>
-          <w:sz w:val="23"/>
+          <w:sz w:val="21"/>
         </w:rPr>
         <w:t>4.1.4 前端实现</w:t>
       </w:r>
@@ -15018,13 +15018,13 @@
     </w:p>
     <w:p>
       <w:pPr>
-        <w:spacing w:before="160" w:after="120" w:line="276" w:lineRule="auto"/>
+        <w:spacing w:before="120" w:after="80" w:line="276" w:lineRule="auto"/>
       </w:pPr>
       <w:r>
         <w:rPr>
           <w:rFonts w:ascii="Times New Roman" w:hAnsi="Times New Roman" w:eastAsia="宋体"/>
           <w:b/>
-          <w:sz w:val="23"/>
+          <w:sz w:val="21"/>
         </w:rPr>
         <w:t>4.1.5 RAG 服务实现</w:t>
       </w:r>
@@ -15045,13 +15045,13 @@
     </w:p>
     <w:p>
       <w:pPr>
-        <w:spacing w:before="160" w:after="120" w:line="276" w:lineRule="auto"/>
+        <w:spacing w:before="120" w:after="80" w:line="276" w:lineRule="auto"/>
       </w:pPr>
       <w:r>
         <w:rPr>
           <w:rFonts w:ascii="Times New Roman" w:hAnsi="Times New Roman" w:eastAsia="宋体"/>
           <w:b/>
-          <w:sz w:val="23"/>
+          <w:sz w:val="21"/>
         </w:rPr>
         <w:t>4.1.6 工具模块实现</w:t>
       </w:r>
@@ -15072,13 +15072,13 @@
     </w:p>
     <w:p>
       <w:pPr>
-        <w:spacing w:before="160" w:after="120" w:line="276" w:lineRule="auto"/>
+        <w:spacing w:before="120" w:after="80" w:line="276" w:lineRule="auto"/>
       </w:pPr>
       <w:r>
         <w:rPr>
           <w:rFonts w:ascii="Times New Roman" w:hAnsi="Times New Roman" w:eastAsia="宋体"/>
           <w:b/>
-          <w:sz w:val="23"/>
+          <w:sz w:val="21"/>
         </w:rPr>
         <w:t>4.1.7 数据库实现</w:t>
       </w:r>
@@ -15099,13 +15099,13 @@
     </w:p>
     <w:p>
       <w:pPr>
-        <w:spacing w:before="160" w:after="120" w:line="276" w:lineRule="auto"/>
+        <w:spacing w:before="120" w:after="80" w:line="276" w:lineRule="auto"/>
       </w:pPr>
       <w:r>
         <w:rPr>
           <w:rFonts w:ascii="Times New Roman" w:hAnsi="Times New Roman" w:eastAsia="宋体"/>
           <w:b/>
-          <w:sz w:val="23"/>
+          <w:sz w:val="21"/>
         </w:rPr>
         <w:t>4.1.8 部署与启动实现</w:t>
       </w:r>
@@ -15182,26 +15182,26 @@
     </w:p>
     <w:p>
       <w:pPr>
-        <w:spacing w:before="160" w:after="120" w:line="276" w:lineRule="auto"/>
+        <w:spacing w:before="120" w:after="80" w:line="276" w:lineRule="auto"/>
       </w:pPr>
       <w:r>
         <w:rPr>
           <w:rFonts w:ascii="Times New Roman" w:hAnsi="Times New Roman" w:eastAsia="宋体"/>
           <w:b/>
-          <w:sz w:val="26"/>
+          <w:sz w:val="21"/>
         </w:rPr>
         <w:t>4.2 关键技术实现</w:t>
       </w:r>
     </w:p>
     <w:p>
       <w:pPr>
-        <w:spacing w:before="160" w:after="120" w:line="276" w:lineRule="auto"/>
+        <w:spacing w:before="120" w:after="80" w:line="276" w:lineRule="auto"/>
       </w:pPr>
       <w:r>
         <w:rPr>
           <w:rFonts w:ascii="Times New Roman" w:hAnsi="Times New Roman" w:eastAsia="宋体"/>
           <w:b/>
-          <w:sz w:val="23"/>
+          <w:sz w:val="21"/>
         </w:rPr>
         <w:t>4.2.1 输入解析与多轮字段合并</w:t>
       </w:r>
@@ -15296,13 +15296,13 @@
     </w:p>
     <w:p>
       <w:pPr>
-        <w:spacing w:before="160" w:after="120" w:line="276" w:lineRule="auto"/>
+        <w:spacing w:before="120" w:after="80" w:line="276" w:lineRule="auto"/>
       </w:pPr>
       <w:r>
         <w:rPr>
           <w:rFonts w:ascii="Times New Roman" w:hAnsi="Times New Roman" w:eastAsia="宋体"/>
           <w:b/>
-          <w:sz w:val="23"/>
+          <w:sz w:val="21"/>
         </w:rPr>
         <w:t>4.2.2 多 Agent 顺序编排</w:t>
       </w:r>
@@ -15399,13 +15399,13 @@
     </w:p>
     <w:p>
       <w:pPr>
-        <w:spacing w:before="160" w:after="120" w:line="276" w:lineRule="auto"/>
+        <w:spacing w:before="120" w:after="80" w:line="276" w:lineRule="auto"/>
       </w:pPr>
       <w:r>
         <w:rPr>
           <w:rFonts w:ascii="Times New Roman" w:hAnsi="Times New Roman" w:eastAsia="宋体"/>
           <w:b/>
-          <w:sz w:val="23"/>
+          <w:sz w:val="21"/>
         </w:rPr>
         <w:t>4.2.3 RAG 检索实现</w:t>
       </w:r>
@@ -15518,13 +15518,13 @@
     </w:p>
     <w:p>
       <w:pPr>
-        <w:spacing w:before="160" w:after="120" w:line="276" w:lineRule="auto"/>
+        <w:spacing w:before="120" w:after="80" w:line="276" w:lineRule="auto"/>
       </w:pPr>
       <w:r>
         <w:rPr>
           <w:rFonts w:ascii="Times New Roman" w:hAnsi="Times New Roman" w:eastAsia="宋体"/>
           <w:b/>
-          <w:sz w:val="23"/>
+          <w:sz w:val="21"/>
         </w:rPr>
         <w:t>4.2.4 成本分析与决策评分实现</w:t>
       </w:r>
@@ -15629,13 +15629,13 @@
     </w:p>
     <w:p>
       <w:pPr>
-        <w:spacing w:before="160" w:after="120" w:line="276" w:lineRule="auto"/>
+        <w:spacing w:before="120" w:after="80" w:line="276" w:lineRule="auto"/>
       </w:pPr>
       <w:r>
         <w:rPr>
           <w:rFonts w:ascii="Times New Roman" w:hAnsi="Times New Roman" w:eastAsia="宋体"/>
           <w:b/>
-          <w:sz w:val="23"/>
+          <w:sz w:val="21"/>
         </w:rPr>
         <w:t>4.2.5 法官规则与模型说明</w:t>
       </w:r>
@@ -15717,13 +15717,13 @@
     </w:p>
     <w:p>
       <w:pPr>
-        <w:spacing w:before="160" w:after="120" w:line="276" w:lineRule="auto"/>
+        <w:spacing w:before="120" w:after="80" w:line="276" w:lineRule="auto"/>
       </w:pPr>
       <w:r>
         <w:rPr>
           <w:rFonts w:ascii="Times New Roman" w:hAnsi="Times New Roman" w:eastAsia="宋体"/>
           <w:b/>
-          <w:sz w:val="23"/>
+          <w:sz w:val="21"/>
         </w:rPr>
         <w:t>4.2.6 JWT 登录与双模式鉴权</w:t>
       </w:r>
@@ -15794,13 +15794,13 @@
     </w:p>
     <w:p>
       <w:pPr>
-        <w:spacing w:before="160" w:after="120" w:line="276" w:lineRule="auto"/>
+        <w:spacing w:before="120" w:after="80" w:line="276" w:lineRule="auto"/>
       </w:pPr>
       <w:r>
         <w:rPr>
           <w:rFonts w:ascii="Times New Roman" w:hAnsi="Times New Roman" w:eastAsia="宋体"/>
           <w:b/>
-          <w:sz w:val="23"/>
+          <w:sz w:val="21"/>
         </w:rPr>
         <w:t>4.2.7 前端关键实现</w:t>
       </w:r>
@@ -15821,13 +15821,13 @@
     </w:p>
     <w:p>
       <w:pPr>
-        <w:spacing w:before="160" w:after="120" w:line="276" w:lineRule="auto"/>
+        <w:spacing w:before="120" w:after="80" w:line="276" w:lineRule="auto"/>
       </w:pPr>
       <w:r>
         <w:rPr>
           <w:rFonts w:ascii="Times New Roman" w:hAnsi="Times New Roman" w:eastAsia="宋体"/>
           <w:b/>
-          <w:sz w:val="23"/>
+          <w:sz w:val="21"/>
         </w:rPr>
         <w:t>4.2.8 异常处理与降级策略</w:t>
       </w:r>
@@ -16239,39 +16239,39 @@
     </w:p>
     <w:p>
       <w:pPr>
-        <w:spacing w:before="240" w:after="120" w:line="276" w:lineRule="auto"/>
+        <w:spacing w:before="200" w:after="80" w:line="276" w:lineRule="auto"/>
       </w:pPr>
       <w:r>
         <w:rPr>
           <w:rFonts w:ascii="Times New Roman" w:hAnsi="Times New Roman" w:eastAsia="宋体"/>
           <w:b/>
-          <w:sz w:val="30"/>
+          <w:sz w:val="21"/>
         </w:rPr>
         <w:t>05 项目测试</w:t>
       </w:r>
     </w:p>
     <w:p>
       <w:pPr>
-        <w:spacing w:before="160" w:after="120" w:line="276" w:lineRule="auto"/>
+        <w:spacing w:before="120" w:after="80" w:line="276" w:lineRule="auto"/>
       </w:pPr>
       <w:r>
         <w:rPr>
           <w:rFonts w:ascii="Times New Roman" w:hAnsi="Times New Roman" w:eastAsia="宋体"/>
           <w:b/>
-          <w:sz w:val="26"/>
+          <w:sz w:val="21"/>
         </w:rPr>
         <w:t>5.1 测试环境与部署</w:t>
       </w:r>
     </w:p>
     <w:p>
       <w:pPr>
-        <w:spacing w:before="160" w:after="120" w:line="276" w:lineRule="auto"/>
+        <w:spacing w:before="120" w:after="80" w:line="276" w:lineRule="auto"/>
       </w:pPr>
       <w:r>
         <w:rPr>
           <w:rFonts w:ascii="Times New Roman" w:hAnsi="Times New Roman" w:eastAsia="宋体"/>
           <w:b/>
-          <w:sz w:val="23"/>
+          <w:sz w:val="21"/>
         </w:rPr>
         <w:t>5.1.1 测试环境</w:t>
       </w:r>
@@ -16702,13 +16702,13 @@
     </w:p>
     <w:p>
       <w:pPr>
-        <w:spacing w:before="160" w:after="120" w:line="276" w:lineRule="auto"/>
+        <w:spacing w:before="120" w:after="80" w:line="276" w:lineRule="auto"/>
       </w:pPr>
       <w:r>
         <w:rPr>
           <w:rFonts w:ascii="Times New Roman" w:hAnsi="Times New Roman" w:eastAsia="宋体"/>
           <w:b/>
-          <w:sz w:val="23"/>
+          <w:sz w:val="21"/>
         </w:rPr>
         <w:t>5.1.2 测试命令</w:t>
       </w:r>
@@ -16769,13 +16769,13 @@
     </w:p>
     <w:p>
       <w:pPr>
-        <w:spacing w:before="160" w:after="120" w:line="276" w:lineRule="auto"/>
+        <w:spacing w:before="120" w:after="80" w:line="276" w:lineRule="auto"/>
       </w:pPr>
       <w:r>
         <w:rPr>
           <w:rFonts w:ascii="Times New Roman" w:hAnsi="Times New Roman" w:eastAsia="宋体"/>
           <w:b/>
-          <w:sz w:val="23"/>
+          <w:sz w:val="21"/>
         </w:rPr>
         <w:t>5.1.3 部署与启动</w:t>
       </w:r>
@@ -16810,13 +16810,13 @@
     </w:p>
     <w:p>
       <w:pPr>
-        <w:spacing w:before="160" w:after="120" w:line="276" w:lineRule="auto"/>
+        <w:spacing w:before="120" w:after="80" w:line="276" w:lineRule="auto"/>
       </w:pPr>
       <w:r>
         <w:rPr>
           <w:rFonts w:ascii="Times New Roman" w:hAnsi="Times New Roman" w:eastAsia="宋体"/>
           <w:b/>
-          <w:sz w:val="26"/>
+          <w:sz w:val="21"/>
         </w:rPr>
         <w:t>5.2 测试策略与测试用例</w:t>
       </w:r>
@@ -18200,26 +18200,26 @@
     </w:p>
     <w:p>
       <w:pPr>
-        <w:spacing w:before="160" w:after="120" w:line="276" w:lineRule="auto"/>
+        <w:spacing w:before="120" w:after="80" w:line="276" w:lineRule="auto"/>
       </w:pPr>
       <w:r>
         <w:rPr>
           <w:rFonts w:ascii="Times New Roman" w:hAnsi="Times New Roman" w:eastAsia="宋体"/>
           <w:b/>
-          <w:sz w:val="26"/>
+          <w:sz w:val="21"/>
         </w:rPr>
         <w:t>5.3 测试执行结果</w:t>
       </w:r>
     </w:p>
     <w:p>
       <w:pPr>
-        <w:spacing w:before="160" w:after="120" w:line="276" w:lineRule="auto"/>
+        <w:spacing w:before="120" w:after="80" w:line="276" w:lineRule="auto"/>
       </w:pPr>
       <w:r>
         <w:rPr>
           <w:rFonts w:ascii="Times New Roman" w:hAnsi="Times New Roman" w:eastAsia="宋体"/>
           <w:b/>
-          <w:sz w:val="23"/>
+          <w:sz w:val="21"/>
         </w:rPr>
         <w:t>5.3.1 全量测试结果</w:t>
       </w:r>
@@ -18256,13 +18256,13 @@
     </w:p>
     <w:p>
       <w:pPr>
-        <w:spacing w:before="160" w:after="120" w:line="276" w:lineRule="auto"/>
+        <w:spacing w:before="120" w:after="80" w:line="276" w:lineRule="auto"/>
       </w:pPr>
       <w:r>
         <w:rPr>
           <w:rFonts w:ascii="Times New Roman" w:hAnsi="Times New Roman" w:eastAsia="宋体"/>
           <w:b/>
-          <w:sz w:val="23"/>
+          <w:sz w:val="21"/>
         </w:rPr>
         <w:t>5.3.2 定向测试结果</w:t>
       </w:r>
@@ -18620,13 +18620,13 @@
     </w:p>
     <w:p>
       <w:pPr>
-        <w:spacing w:before="160" w:after="120" w:line="276" w:lineRule="auto"/>
+        <w:spacing w:before="120" w:after="80" w:line="276" w:lineRule="auto"/>
       </w:pPr>
       <w:r>
         <w:rPr>
           <w:rFonts w:ascii="Times New Roman" w:hAnsi="Times New Roman" w:eastAsia="宋体"/>
           <w:b/>
-          <w:sz w:val="23"/>
+          <w:sz w:val="21"/>
         </w:rPr>
         <w:t>5.3.3 失败项与原因分析</w:t>
       </w:r>
@@ -19102,13 +19102,13 @@
     </w:p>
     <w:p>
       <w:pPr>
-        <w:spacing w:before="160" w:after="120" w:line="276" w:lineRule="auto"/>
+        <w:spacing w:before="120" w:after="80" w:line="276" w:lineRule="auto"/>
       </w:pPr>
       <w:r>
         <w:rPr>
           <w:rFonts w:ascii="Times New Roman" w:hAnsi="Times New Roman" w:eastAsia="宋体"/>
           <w:b/>
-          <w:sz w:val="23"/>
+          <w:sz w:val="21"/>
         </w:rPr>
         <w:t>5.3.4 测试结果统计图</w:t>
       </w:r>
@@ -19182,26 +19182,26 @@
     </w:p>
     <w:p>
       <w:pPr>
-        <w:spacing w:before="160" w:after="120" w:line="276" w:lineRule="auto"/>
+        <w:spacing w:before="120" w:after="80" w:line="276" w:lineRule="auto"/>
       </w:pPr>
       <w:r>
         <w:rPr>
           <w:rFonts w:ascii="Times New Roman" w:hAnsi="Times New Roman" w:eastAsia="宋体"/>
           <w:b/>
-          <w:sz w:val="26"/>
+          <w:sz w:val="21"/>
         </w:rPr>
         <w:t>5.4 RAG 检索评测</w:t>
       </w:r>
     </w:p>
     <w:p>
       <w:pPr>
-        <w:spacing w:before="160" w:after="120" w:line="276" w:lineRule="auto"/>
+        <w:spacing w:before="120" w:after="80" w:line="276" w:lineRule="auto"/>
       </w:pPr>
       <w:r>
         <w:rPr>
           <w:rFonts w:ascii="Times New Roman" w:hAnsi="Times New Roman" w:eastAsia="宋体"/>
           <w:b/>
-          <w:sz w:val="23"/>
+          <w:sz w:val="21"/>
         </w:rPr>
         <w:t>5.4.1 检索命中评测</w:t>
       </w:r>
@@ -19989,13 +19989,13 @@
     </w:p>
     <w:p>
       <w:pPr>
-        <w:spacing w:before="160" w:after="120" w:line="276" w:lineRule="auto"/>
+        <w:spacing w:before="120" w:after="80" w:line="276" w:lineRule="auto"/>
       </w:pPr>
       <w:r>
         <w:rPr>
           <w:rFonts w:ascii="Times New Roman" w:hAnsi="Times New Roman" w:eastAsia="宋体"/>
           <w:b/>
-          <w:sz w:val="23"/>
+          <w:sz w:val="21"/>
         </w:rPr>
         <w:t>5.4.2 检索指标评测</w:t>
       </w:r>
@@ -20656,13 +20656,13 @@
     </w:p>
     <w:p>
       <w:pPr>
-        <w:spacing w:before="160" w:after="120" w:line="276" w:lineRule="auto"/>
+        <w:spacing w:before="120" w:after="80" w:line="276" w:lineRule="auto"/>
       </w:pPr>
       <w:r>
         <w:rPr>
           <w:rFonts w:ascii="Times New Roman" w:hAnsi="Times New Roman" w:eastAsia="宋体"/>
           <w:b/>
-          <w:sz w:val="23"/>
+          <w:sz w:val="21"/>
         </w:rPr>
         <w:t>5.4.3 RAG 服务与异常场景</w:t>
       </w:r>
@@ -20753,13 +20753,13 @@
     </w:p>
     <w:p>
       <w:pPr>
-        <w:spacing w:before="160" w:after="120" w:line="276" w:lineRule="auto"/>
+        <w:spacing w:before="120" w:after="80" w:line="276" w:lineRule="auto"/>
       </w:pPr>
       <w:r>
         <w:rPr>
           <w:rFonts w:ascii="Times New Roman" w:hAnsi="Times New Roman" w:eastAsia="宋体"/>
           <w:b/>
-          <w:sz w:val="26"/>
+          <w:sz w:val="21"/>
         </w:rPr>
         <w:t>5.5 缺陷与修复</w:t>
       </w:r>
@@ -21707,26 +21707,26 @@
     </w:p>
     <w:p>
       <w:pPr>
-        <w:spacing w:before="160" w:after="120" w:line="276" w:lineRule="auto"/>
+        <w:spacing w:before="120" w:after="80" w:line="276" w:lineRule="auto"/>
       </w:pPr>
       <w:r>
         <w:rPr>
           <w:rFonts w:ascii="Times New Roman" w:hAnsi="Times New Roman" w:eastAsia="宋体"/>
           <w:b/>
-          <w:sz w:val="26"/>
+          <w:sz w:val="21"/>
         </w:rPr>
         <w:t>5.6 项目展示</w:t>
       </w:r>
     </w:p>
     <w:p>
       <w:pPr>
-        <w:spacing w:before="160" w:after="120" w:line="276" w:lineRule="auto"/>
+        <w:spacing w:before="120" w:after="80" w:line="276" w:lineRule="auto"/>
       </w:pPr>
       <w:r>
         <w:rPr>
           <w:rFonts w:ascii="Times New Roman" w:hAnsi="Times New Roman" w:eastAsia="宋体"/>
           <w:b/>
-          <w:sz w:val="23"/>
+          <w:sz w:val="21"/>
         </w:rPr>
         <w:t>5.6.1 购物决策完整流程</w:t>
       </w:r>
@@ -21845,13 +21845,13 @@
     </w:p>
     <w:p>
       <w:pPr>
-        <w:spacing w:before="160" w:after="120" w:line="276" w:lineRule="auto"/>
+        <w:spacing w:before="120" w:after="80" w:line="276" w:lineRule="auto"/>
       </w:pPr>
       <w:r>
         <w:rPr>
           <w:rFonts w:ascii="Times New Roman" w:hAnsi="Times New Roman" w:eastAsia="宋体"/>
           <w:b/>
-          <w:sz w:val="23"/>
+          <w:sz w:val="21"/>
         </w:rPr>
         <w:t>5.6.2 多轮价格纠正流程</w:t>
       </w:r>
@@ -21942,13 +21942,13 @@
     </w:p>
     <w:p>
       <w:pPr>
-        <w:spacing w:before="160" w:after="120" w:line="276" w:lineRule="auto"/>
+        <w:spacing w:before="120" w:after="80" w:line="276" w:lineRule="auto"/>
       </w:pPr>
       <w:r>
         <w:rPr>
           <w:rFonts w:ascii="Times New Roman" w:hAnsi="Times New Roman" w:eastAsia="宋体"/>
           <w:b/>
-          <w:sz w:val="23"/>
+          <w:sz w:val="21"/>
         </w:rPr>
         <w:t>5.6.3 工具调用与 RAG 输出</w:t>
       </w:r>
@@ -22039,13 +22039,13 @@
     </w:p>
     <w:p>
       <w:pPr>
-        <w:spacing w:before="160" w:after="120" w:line="276" w:lineRule="auto"/>
+        <w:spacing w:before="120" w:after="80" w:line="276" w:lineRule="auto"/>
       </w:pPr>
       <w:r>
         <w:rPr>
           <w:rFonts w:ascii="Times New Roman" w:hAnsi="Times New Roman" w:eastAsia="宋体"/>
           <w:b/>
-          <w:sz w:val="26"/>
+          <w:sz w:val="21"/>
         </w:rPr>
         <w:t>5.7 测试结论</w:t>
       </w:r>
@@ -22127,39 +22127,39 @@
     </w:p>
     <w:p>
       <w:pPr>
-        <w:spacing w:before="240" w:after="120" w:line="276" w:lineRule="auto"/>
+        <w:spacing w:before="200" w:after="80" w:line="276" w:lineRule="auto"/>
       </w:pPr>
       <w:r>
         <w:rPr>
           <w:rFonts w:ascii="Times New Roman" w:hAnsi="Times New Roman" w:eastAsia="宋体"/>
           <w:b/>
-          <w:sz w:val="30"/>
+          <w:sz w:val="21"/>
         </w:rPr>
         <w:t>06 项目总结</w:t>
       </w:r>
     </w:p>
     <w:p>
       <w:pPr>
-        <w:spacing w:before="160" w:after="120" w:line="276" w:lineRule="auto"/>
+        <w:spacing w:before="120" w:after="80" w:line="276" w:lineRule="auto"/>
       </w:pPr>
       <w:r>
         <w:rPr>
           <w:rFonts w:ascii="Times New Roman" w:hAnsi="Times New Roman" w:eastAsia="宋体"/>
           <w:b/>
-          <w:sz w:val="26"/>
+          <w:sz w:val="21"/>
         </w:rPr>
         <w:t>6.1 项目总结与体会</w:t>
       </w:r>
     </w:p>
     <w:p>
       <w:pPr>
-        <w:spacing w:before="160" w:after="120" w:line="276" w:lineRule="auto"/>
+        <w:spacing w:before="120" w:after="80" w:line="276" w:lineRule="auto"/>
       </w:pPr>
       <w:r>
         <w:rPr>
           <w:rFonts w:ascii="Times New Roman" w:hAnsi="Times New Roman" w:eastAsia="宋体"/>
           <w:b/>
-          <w:sz w:val="23"/>
+          <w:sz w:val="21"/>
         </w:rPr>
         <w:t>6.1.1 项目完成情况</w:t>
       </w:r>
@@ -22208,13 +22208,13 @@
     </w:p>
     <w:p>
       <w:pPr>
-        <w:spacing w:before="160" w:after="120" w:line="276" w:lineRule="auto"/>
+        <w:spacing w:before="120" w:after="80" w:line="276" w:lineRule="auto"/>
       </w:pPr>
       <w:r>
         <w:rPr>
           <w:rFonts w:ascii="Times New Roman" w:hAnsi="Times New Roman" w:eastAsia="宋体"/>
           <w:b/>
-          <w:sz w:val="23"/>
+          <w:sz w:val="21"/>
         </w:rPr>
         <w:t>6.1.2 技术收获</w:t>
       </w:r>
@@ -22487,13 +22487,13 @@
     </w:p>
     <w:p>
       <w:pPr>
-        <w:spacing w:before="160" w:after="120" w:line="276" w:lineRule="auto"/>
+        <w:spacing w:before="120" w:after="80" w:line="276" w:lineRule="auto"/>
       </w:pPr>
       <w:r>
         <w:rPr>
           <w:rFonts w:ascii="Times New Roman" w:hAnsi="Times New Roman" w:eastAsia="宋体"/>
           <w:b/>
-          <w:sz w:val="23"/>
+          <w:sz w:val="21"/>
         </w:rPr>
         <w:t>6.1.3 团队协作体会</w:t>
       </w:r>
@@ -22528,13 +22528,13 @@
     </w:p>
     <w:p>
       <w:pPr>
-        <w:spacing w:before="160" w:after="120" w:line="276" w:lineRule="auto"/>
+        <w:spacing w:before="120" w:after="80" w:line="276" w:lineRule="auto"/>
       </w:pPr>
       <w:r>
         <w:rPr>
           <w:rFonts w:ascii="Times New Roman" w:hAnsi="Times New Roman" w:eastAsia="宋体"/>
           <w:b/>
-          <w:sz w:val="26"/>
+          <w:sz w:val="21"/>
         </w:rPr>
         <w:t>6.2 不足与改进</w:t>
       </w:r>
@@ -23159,13 +23159,13 @@
     </w:p>
     <w:p>
       <w:pPr>
-        <w:spacing w:before="160" w:after="120" w:line="276" w:lineRule="auto"/>
+        <w:spacing w:before="120" w:after="80" w:line="276" w:lineRule="auto"/>
       </w:pPr>
       <w:r>
         <w:rPr>
           <w:rFonts w:ascii="Times New Roman" w:hAnsi="Times New Roman" w:eastAsia="宋体"/>
           <w:b/>
-          <w:sz w:val="26"/>
+          <w:sz w:val="21"/>
         </w:rPr>
         <w:t>6.3 后续计划</w:t>
       </w:r>
@@ -23247,26 +23247,26 @@
     </w:p>
     <w:p>
       <w:pPr>
-        <w:spacing w:before="240" w:after="120" w:line="276" w:lineRule="auto"/>
+        <w:spacing w:before="200" w:after="80" w:line="276" w:lineRule="auto"/>
       </w:pPr>
       <w:r>
         <w:rPr>
           <w:rFonts w:ascii="Times New Roman" w:hAnsi="Times New Roman" w:eastAsia="宋体"/>
           <w:b/>
-          <w:sz w:val="30"/>
+          <w:sz w:val="21"/>
         </w:rPr>
         <w:t>07 参考文献与附录</w:t>
       </w:r>
     </w:p>
     <w:p>
       <w:pPr>
-        <w:spacing w:before="160" w:after="120" w:line="276" w:lineRule="auto"/>
+        <w:spacing w:before="120" w:after="80" w:line="276" w:lineRule="auto"/>
       </w:pPr>
       <w:r>
         <w:rPr>
           <w:rFonts w:ascii="Times New Roman" w:hAnsi="Times New Roman" w:eastAsia="宋体"/>
           <w:b/>
-          <w:sz w:val="26"/>
+          <w:sz w:val="21"/>
         </w:rPr>
         <w:t>7.1 参考文献</w:t>
       </w:r>
@@ -23323,13 +23323,13 @@
     </w:p>
     <w:p>
       <w:pPr>
-        <w:spacing w:before="160" w:after="120" w:line="276" w:lineRule="auto"/>
+        <w:spacing w:before="120" w:after="80" w:line="276" w:lineRule="auto"/>
       </w:pPr>
       <w:r>
         <w:rPr>
           <w:rFonts w:ascii="Times New Roman" w:hAnsi="Times New Roman" w:eastAsia="宋体"/>
           <w:b/>
-          <w:sz w:val="26"/>
+          <w:sz w:val="21"/>
         </w:rPr>
         <w:t>7.2 附录 A：接口一览</w:t>
       </w:r>
@@ -24721,13 +24721,13 @@
     </w:p>
     <w:p>
       <w:pPr>
-        <w:spacing w:before="160" w:after="120" w:line="276" w:lineRule="auto"/>
+        <w:spacing w:before="120" w:after="80" w:line="276" w:lineRule="auto"/>
       </w:pPr>
       <w:r>
         <w:rPr>
           <w:rFonts w:ascii="Times New Roman" w:hAnsi="Times New Roman" w:eastAsia="宋体"/>
           <w:b/>
-          <w:sz w:val="26"/>
+          <w:sz w:val="21"/>
         </w:rPr>
         <w:t>7.3 附录 B：启动与测试命令</w:t>
       </w:r>
@@ -24773,13 +24773,13 @@
     </w:p>
     <w:p>
       <w:pPr>
-        <w:spacing w:before="160" w:after="120" w:line="276" w:lineRule="auto"/>
+        <w:spacing w:before="120" w:after="80" w:line="276" w:lineRule="auto"/>
       </w:pPr>
       <w:r>
         <w:rPr>
           <w:rFonts w:ascii="Times New Roman" w:hAnsi="Times New Roman" w:eastAsia="宋体"/>
           <w:b/>
-          <w:sz w:val="26"/>
+          <w:sz w:val="21"/>
         </w:rPr>
         <w:t>7.4 附录 C：演示案例</w:t>
       </w:r>
@@ -25128,13 +25128,13 @@
     </w:p>
     <w:p>
       <w:pPr>
-        <w:spacing w:before="160" w:after="120" w:line="276" w:lineRule="auto"/>
+        <w:spacing w:before="120" w:after="80" w:line="276" w:lineRule="auto"/>
       </w:pPr>
       <w:r>
         <w:rPr>
           <w:rFonts w:ascii="Times New Roman" w:hAnsi="Times New Roman" w:eastAsia="宋体"/>
           <w:b/>
-          <w:sz w:val="26"/>
+          <w:sz w:val="21"/>
         </w:rPr>
         <w:t>7.5 附录 D：团队成员分工</w:t>
       </w:r>
@@ -25639,13 +25639,13 @@
     </w:p>
     <w:p>
       <w:pPr>
-        <w:spacing w:before="160" w:after="120" w:line="276" w:lineRule="auto"/>
+        <w:spacing w:before="120" w:after="80" w:line="276" w:lineRule="auto"/>
       </w:pPr>
       <w:r>
         <w:rPr>
           <w:rFonts w:ascii="Times New Roman" w:hAnsi="Times New Roman" w:eastAsia="宋体"/>
           <w:b/>
-          <w:sz w:val="26"/>
+          <w:sz w:val="21"/>
         </w:rPr>
         <w:t>7.6 附录 E：测试结果摘要</w:t>
       </w:r>

</xml_diff>

<commit_message>
docs: unify test group naming in report
</commit_message>
<xml_diff>
--- a/docs/report/DecisionJury_小学期实验报告.docx
+++ b/docs/report/DecisionJury_小学期实验报告.docx
@@ -16729,7 +16729,7 @@
         <w:t>uv run --frozen pytest -p no:cacheprovider tests -q --tb=line --show-capture=no</w:t>
         <w:br/>
         <w:br/>
-        <w:t># C 模块、LLM、adapter 定向测试</w:t>
+        <w:t># C Agent/LLM/adapter 定向测试</w:t>
         <w:br/>
         <w:t>uv run --frozen pytest -p no:cacheprovider tests/test_input_parser.py \</w:t>
         <w:br/>
@@ -16756,7 +16756,7 @@
         <w:t xml:space="preserve">  tests/test_mcp_tools.py tests/test_tools_router.py</w:t>
         <w:br/>
         <w:br/>
-        <w:t># B 路由与迁移测试</w:t>
+        <w:t># B 后端路由与迁移测试</w:t>
         <w:br/>
         <w:t>uv run --frozen pytest -p no:cacheprovider tests/test_cases_router.py \</w:t>
         <w:br/>
@@ -18371,7 +18371,7 @@
                 <w:b w:val="0"/>
                 <w:sz w:val="18"/>
               </w:rPr>
-              <w:t>C 模块、LLM、RAG/MCP adapter</w:t>
+              <w:t>C Agent/LLM/RAG-MCP adapter</w:t>
             </w:r>
           </w:p>
         </w:tc>
@@ -18430,7 +18430,7 @@
                 <w:b w:val="0"/>
                 <w:sz w:val="18"/>
               </w:rPr>
-              <w:t>RAG 检索、数据加载、评测指标</w:t>
+              <w:t>D RAG 检索、数据加载、评测指标</w:t>
             </w:r>
           </w:p>
         </w:tc>
@@ -18489,7 +18489,7 @@
                 <w:b w:val="0"/>
                 <w:sz w:val="18"/>
               </w:rPr>
-              <w:t>MCP 工具、评分、提醒、工具路由</w:t>
+              <w:t>E MCP 工具、评分、提醒、工具路由</w:t>
             </w:r>
           </w:p>
         </w:tc>
@@ -18548,7 +18548,7 @@
                 <w:b w:val="0"/>
                 <w:sz w:val="18"/>
               </w:rPr>
-              <w:t>B 路由、消息、辩论、历史、观察清单、轨迹、迁移</w:t>
+              <w:t>B 后端路由、消息、辩论、历史、观察清单、轨迹、迁移</w:t>
             </w:r>
           </w:p>
         </w:tc>
@@ -18615,7 +18615,7 @@
           <w:b w:val="0"/>
           <w:sz w:val="21"/>
         </w:rPr>
-        <w:t>从分组结果可以看出，Agent 编排、LLM 客户端、RAG 检索、工具模块和 adapter 相关测试全部通过；失败集中在 B 路由和迁移测试中。</w:t>
+        <w:t>从分组结果可以看出，Agent 编排、LLM 客户端、RAG 检索、工具模块和 adapter 相关测试全部通过；失败集中在 B 后端路由和迁移测试中。</w:t>
       </w:r>
     </w:p>
     <w:p>
@@ -23181,7 +23181,7 @@
           <w:b w:val="0"/>
           <w:sz w:val="21"/>
         </w:rPr>
-        <w:t>1. 答辩前优先修复 B 路由与 JWT 行为不一致的测试，修复迁移测试引擎隔离问题，争取全量测试回到稳定通过状态。</w:t>
+        <w:t>1. 答辩前优先修复 B 后端路由与 JWT 行为不一致的测试，修复迁移测试引擎隔离问题，争取全量测试回到稳定通过状态。</w:t>
       </w:r>
     </w:p>
     <w:p>
@@ -25719,7 +25719,7 @@
                 <w:b w:val="0"/>
                 <w:sz w:val="18"/>
               </w:rPr>
-              <w:t>C 模块、LLM、RAG/MCP adapter</w:t>
+              <w:t>C Agent/LLM/RAG-MCP adapter</w:t>
             </w:r>
           </w:p>
         </w:tc>
@@ -25759,7 +25759,7 @@
                 <w:b w:val="0"/>
                 <w:sz w:val="18"/>
               </w:rPr>
-              <w:t>RAG 检索、数据加载、评测指标</w:t>
+              <w:t>D RAG 检索、数据加载、评测指标</w:t>
             </w:r>
           </w:p>
         </w:tc>
@@ -25799,7 +25799,7 @@
                 <w:b w:val="0"/>
                 <w:sz w:val="18"/>
               </w:rPr>
-              <w:t>MCP 工具、评分、提醒、工具路由</w:t>
+              <w:t>E MCP 工具、评分、提醒、工具路由</w:t>
             </w:r>
           </w:p>
         </w:tc>
@@ -25839,7 +25839,7 @@
                 <w:b w:val="0"/>
                 <w:sz w:val="18"/>
               </w:rPr>
-              <w:t>B 路由、消息、辩论、历史、观察清单、轨迹、迁移</w:t>
+              <w:t>B 后端路由、消息、辩论、历史、观察清单、轨迹、迁移</w:t>
             </w:r>
           </w:p>
         </w:tc>
@@ -25879,7 +25879,7 @@
                 <w:b w:val="0"/>
                 <w:sz w:val="18"/>
               </w:rPr>
-              <w:t>全量 tests/</w:t>
+              <w:t>全量 tests/（A-E 汇总）</w:t>
             </w:r>
           </w:p>
         </w:tc>

</xml_diff>

<commit_message>
docs: align figure file names with captions
</commit_message>
<xml_diff>
--- a/docs/report/DecisionJury_小学期实验报告.docx
+++ b/docs/report/DecisionJury_小学期实验报告.docx
@@ -13082,7 +13082,7 @@
               <a:graphicData uri="http://schemas.openxmlformats.org/drawingml/2006/picture">
                 <pic:pic>
                   <pic:nvPicPr>
-                    <pic:cNvPr id="0" name="fig_3_4_login.png"/>
+                    <pic:cNvPr id="0" name="fig_3_3_login.png"/>
                     <pic:cNvPicPr/>
                   </pic:nvPicPr>
                   <pic:blipFill>
@@ -13270,7 +13270,7 @@
               <a:graphicData uri="http://schemas.openxmlformats.org/drawingml/2006/picture">
                 <pic:pic>
                   <pic:nvPicPr>
-                    <pic:cNvPr id="0" name="fig_3_4_chat.png"/>
+                    <pic:cNvPr id="0" name="fig_3_5_chat.png"/>
                     <pic:cNvPicPr/>
                   </pic:nvPicPr>
                   <pic:blipFill>
@@ -13364,7 +13364,7 @@
               <a:graphicData uri="http://schemas.openxmlformats.org/drawingml/2006/picture">
                 <pic:pic>
                   <pic:nvPicPr>
-                    <pic:cNvPr id="0" name="fig_3_4_verdict.png"/>
+                    <pic:cNvPr id="0" name="fig_3_6_verdict.png"/>
                     <pic:cNvPicPr/>
                   </pic:nvPicPr>
                   <pic:blipFill>
@@ -13458,7 +13458,7 @@
               <a:graphicData uri="http://schemas.openxmlformats.org/drawingml/2006/picture">
                 <pic:pic>
                   <pic:nvPicPr>
-                    <pic:cNvPr id="0" name="fig_3_4_history.png"/>
+                    <pic:cNvPr id="0" name="fig_3_7_history.png"/>
                     <pic:cNvPicPr/>
                   </pic:nvPicPr>
                   <pic:blipFill>
@@ -19129,7 +19129,7 @@
               <a:graphicData uri="http://schemas.openxmlformats.org/drawingml/2006/picture">
                 <pic:pic>
                   <pic:nvPicPr>
-                    <pic:cNvPr id="0" name="fig_5_2_test_results.png"/>
+                    <pic:cNvPr id="0" name="fig_5_1_test_results.png"/>
                     <pic:cNvPicPr/>
                   </pic:nvPicPr>
                   <pic:blipFill>
@@ -20547,7 +20547,7 @@
               <a:graphicData uri="http://schemas.openxmlformats.org/drawingml/2006/picture">
                 <pic:pic>
                   <pic:nvPicPr>
-                    <pic:cNvPr id="0" name="fig_5_1_rag_metrics.png"/>
+                    <pic:cNvPr id="0" name="fig_5_2_rag_metrics.png"/>
                     <pic:cNvPicPr/>
                   </pic:nvPicPr>
                   <pic:blipFill>

</xml_diff>

<commit_message>
docs: add chat, tool log and RAG screenshots to report
</commit_message>
<xml_diff>
--- a/docs/report/DecisionJury_小学期实验报告.docx
+++ b/docs/report/DecisionJury_小学期实验报告.docx
@@ -22374,8 +22374,75 @@
       <w:r>
         <w:drawing>
           <wp:inline xmlns:a="http://schemas.openxmlformats.org/drawingml/2006/main" xmlns:pic="http://schemas.openxmlformats.org/drawingml/2006/picture">
+            <wp:extent cx="5486400" cy="2740205"/>
+            <wp:docPr id="17" name="Picture 17"/>
+            <wp:cNvGraphicFramePr>
+              <a:graphicFrameLocks noChangeAspect="1"/>
+            </wp:cNvGraphicFramePr>
+            <a:graphic>
+              <a:graphicData uri="http://schemas.openxmlformats.org/drawingml/2006/picture">
+                <pic:pic>
+                  <pic:nvPicPr>
+                    <pic:cNvPr id="0" name="shot_09_chat.png"/>
+                    <pic:cNvPicPr/>
+                  </pic:nvPicPr>
+                  <pic:blipFill>
+                    <a:blip r:embed="rId32"/>
+                    <a:stretch>
+                      <a:fillRect/>
+                    </a:stretch>
+                  </pic:blipFill>
+                  <pic:spPr>
+                    <a:xfrm>
+                      <a:off x="0" y="0"/>
+                      <a:ext cx="5486400" cy="2740205"/>
+                    </a:xfrm>
+                    <a:prstGeom prst="rect"/>
+                  </pic:spPr>
+                </pic:pic>
+              </a:graphicData>
+            </a:graphic>
+          </wp:inline>
+        </w:drawing>
+      </w:r>
+    </w:p>
+    <w:p>
+      <w:pPr>
+        <w:spacing w:after="160"/>
+        <w:jc w:val="center"/>
+      </w:pPr>
+      <w:r>
+        <w:rPr>
+          <w:rFonts w:ascii="Times New Roman" w:hAnsi="Times New Roman" w:eastAsia="宋体"/>
+          <w:b w:val="0"/>
+          <w:sz w:val="18"/>
+        </w:rPr>
+        <w:t>图 5-7 多轮对话页面</w:t>
+      </w:r>
+    </w:p>
+    <w:p>
+      <w:pPr>
+        <w:spacing w:after="120" w:line="360" w:lineRule="auto"/>
+        <w:ind w:firstLine="420"/>
+      </w:pPr>
+      <w:r>
+        <w:rPr>
+          <w:rFonts w:ascii="Times New Roman" w:hAnsi="Times New Roman" w:eastAsia="宋体"/>
+          <w:b w:val="0"/>
+          <w:sz w:val="21"/>
+        </w:rPr>
+        <w:t>图 5-7 多轮对话页面</w:t>
+      </w:r>
+    </w:p>
+    <w:p>
+      <w:pPr>
+        <w:jc w:val="center"/>
+      </w:pPr>
+      <w:r>
+        <w:drawing>
+          <wp:inline xmlns:a="http://schemas.openxmlformats.org/drawingml/2006/main" xmlns:pic="http://schemas.openxmlformats.org/drawingml/2006/picture">
             <wp:extent cx="5486400" cy="8936987"/>
-            <wp:docPr id="17" name="Picture 17"/>
+            <wp:docPr id="18" name="Picture 18"/>
             <wp:cNvGraphicFramePr>
               <a:graphicFrameLocks noChangeAspect="1"/>
             </wp:cNvGraphicFramePr>
@@ -22387,7 +22454,7 @@
                     <pic:cNvPicPr/>
                   </pic:nvPicPr>
                   <pic:blipFill>
-                    <a:blip r:embed="rId32"/>
+                    <a:blip r:embed="rId33"/>
                     <a:stretch>
                       <a:fillRect/>
                     </a:stretch>
@@ -22417,7 +22484,7 @@
           <w:b w:val="0"/>
           <w:sz w:val="18"/>
         </w:rPr>
-        <w:t>图 5-7 判决书页面（一）：案件摘要、正反方观点与最终裁决</w:t>
+        <w:t>图 5-8 判决书页面（一）：案件摘要、正反方观点与最终裁决</w:t>
       </w:r>
     </w:p>
     <w:p>
@@ -22431,7 +22498,7 @@
           <w:b w:val="0"/>
           <w:sz w:val="21"/>
         </w:rPr>
-        <w:t>图 5-7 判决书页面（一）：案件摘要、正反方观点与最终裁决</w:t>
+        <w:t>图 5-8 判决书页面（一）：案件摘要、正反方观点与最终裁决</w:t>
       </w:r>
     </w:p>
     <w:p>
@@ -22442,7 +22509,7 @@
         <w:drawing>
           <wp:inline xmlns:a="http://schemas.openxmlformats.org/drawingml/2006/main" xmlns:pic="http://schemas.openxmlformats.org/drawingml/2006/picture">
             <wp:extent cx="5486400" cy="11256091"/>
-            <wp:docPr id="18" name="Picture 18"/>
+            <wp:docPr id="19" name="Picture 19"/>
             <wp:cNvGraphicFramePr>
               <a:graphicFrameLocks noChangeAspect="1"/>
             </wp:cNvGraphicFramePr>
@@ -22454,7 +22521,7 @@
                     <pic:cNvPicPr/>
                   </pic:nvPicPr>
                   <pic:blipFill>
-                    <a:blip r:embed="rId33"/>
+                    <a:blip r:embed="rId34"/>
                     <a:stretch>
                       <a:fillRect/>
                     </a:stretch>
@@ -22484,7 +22551,7 @@
           <w:b w:val="0"/>
           <w:sz w:val="18"/>
         </w:rPr>
-        <w:t>图 5-8 判决书页面（二）：RAG 证据、工具结果与后续动作</w:t>
+        <w:t>图 5-9 判决书页面（二）：RAG 证据、工具结果与后续动作</w:t>
       </w:r>
     </w:p>
     <w:p>
@@ -22498,7 +22565,7 @@
           <w:b w:val="0"/>
           <w:sz w:val="21"/>
         </w:rPr>
-        <w:t>图 5-8 判决书页面（二）：RAG 证据、工具结果与后续动作</w:t>
+        <w:t>图 5-9 判决书页面（二）：RAG 证据、工具结果与后续动作</w:t>
       </w:r>
     </w:p>
     <w:p>
@@ -22509,7 +22576,7 @@
         <w:drawing>
           <wp:inline xmlns:a="http://schemas.openxmlformats.org/drawingml/2006/main" xmlns:pic="http://schemas.openxmlformats.org/drawingml/2006/picture">
             <wp:extent cx="5486400" cy="16472431"/>
-            <wp:docPr id="19" name="Picture 19"/>
+            <wp:docPr id="20" name="Picture 20"/>
             <wp:cNvGraphicFramePr>
               <a:graphicFrameLocks noChangeAspect="1"/>
             </wp:cNvGraphicFramePr>
@@ -22521,7 +22588,7 @@
                     <pic:cNvPicPr/>
                   </pic:nvPicPr>
                   <pic:blipFill>
-                    <a:blip r:embed="rId34"/>
+                    <a:blip r:embed="rId35"/>
                     <a:stretch>
                       <a:fillRect/>
                     </a:stretch>
@@ -22551,7 +22618,7 @@
           <w:b w:val="0"/>
           <w:sz w:val="18"/>
         </w:rPr>
-        <w:t>图 5-9 执行轨迹页面</w:t>
+        <w:t>图 5-10 执行轨迹页面</w:t>
       </w:r>
     </w:p>
     <w:p>
@@ -22565,7 +22632,7 @@
           <w:b w:val="0"/>
           <w:sz w:val="21"/>
         </w:rPr>
-        <w:t>图 5-9 执行轨迹页面</w:t>
+        <w:t>图 5-10 执行轨迹页面</w:t>
       </w:r>
     </w:p>
     <w:p>
@@ -22576,7 +22643,7 @@
         <w:drawing>
           <wp:inline xmlns:a="http://schemas.openxmlformats.org/drawingml/2006/main" xmlns:pic="http://schemas.openxmlformats.org/drawingml/2006/picture">
             <wp:extent cx="5486400" cy="2017059"/>
-            <wp:docPr id="20" name="Picture 20"/>
+            <wp:docPr id="21" name="Picture 21"/>
             <wp:cNvGraphicFramePr>
               <a:graphicFrameLocks noChangeAspect="1"/>
             </wp:cNvGraphicFramePr>
@@ -22588,7 +22655,7 @@
                     <pic:cNvPicPr/>
                   </pic:nvPicPr>
                   <pic:blipFill>
-                    <a:blip r:embed="rId35"/>
+                    <a:blip r:embed="rId36"/>
                     <a:stretch>
                       <a:fillRect/>
                     </a:stretch>
@@ -22618,7 +22685,7 @@
           <w:b w:val="0"/>
           <w:sz w:val="18"/>
         </w:rPr>
-        <w:t>图 5-10 观察清单页面</w:t>
+        <w:t>图 5-11 观察清单页面</w:t>
       </w:r>
     </w:p>
     <w:p>
@@ -22632,21 +22699,7 @@
           <w:b w:val="0"/>
           <w:sz w:val="21"/>
         </w:rPr>
-        <w:t>图 5-10 观察清单页面</w:t>
-      </w:r>
-    </w:p>
-    <w:p>
-      <w:pPr>
-        <w:spacing w:after="120" w:line="360" w:lineRule="auto"/>
-      </w:pPr>
-      <w:r>
-        <w:rPr>
-          <w:rFonts w:ascii="Times New Roman" w:hAnsi="Times New Roman" w:eastAsia="宋体"/>
-          <w:b w:val="0"/>
-          <w:color w:val="555555"/>
-          <w:sz w:val="18"/>
-        </w:rPr>
-        <w:t>待补截图：多轮对话页（包含“本月预算还剩 3000 元，已有普通耳机”的补充过程）。拍摄方法见 docs/report/替换实际运行截图指南.md 第 5 节。</w:t>
+        <w:t>图 5-11 观察清单页面</w:t>
       </w:r>
     </w:p>
     <w:p>
@@ -22746,7 +22799,7 @@
           <w:color w:val="555555"/>
           <w:sz w:val="18"/>
         </w:rPr>
-        <w:t>待补截图：多轮价格纠正后的字段展示。 操作路径：登录后在案件创建页输入“想买一部手机，预算 3000 元”，进入多轮对话页依次发送“价格大概是 2500 元”和“刚才价格说错了，不是 2500，是 2200”，截取价格更新为 2200、预算保持 3000 的页面。</w:t>
+        <w:t>待补截图（图 5-14）：多轮价格纠正后的字段展示。 操作路径：登录后在案件创建页输入“想买一部手机，预算 3000 元”，进入多轮对话页依次发送“价格大概是 2500 元”和“刚才价格说错了，不是 2500，是 2200”，截取价格更新为 2200、预算保持 3000 的页面。 建议文件名：docs/report/assets/screenshots/shot_12_price_correction.png。</w:t>
       </w:r>
     </w:p>
     <w:p>
@@ -22837,6 +22890,140 @@
     </w:p>
     <w:p>
       <w:pPr>
+        <w:jc w:val="center"/>
+      </w:pPr>
+      <w:r>
+        <w:drawing>
+          <wp:inline xmlns:a="http://schemas.openxmlformats.org/drawingml/2006/main" xmlns:pic="http://schemas.openxmlformats.org/drawingml/2006/picture">
+            <wp:extent cx="5486400" cy="5267175"/>
+            <wp:docPr id="22" name="Picture 22"/>
+            <wp:cNvGraphicFramePr>
+              <a:graphicFrameLocks noChangeAspect="1"/>
+            </wp:cNvGraphicFramePr>
+            <a:graphic>
+              <a:graphicData uri="http://schemas.openxmlformats.org/drawingml/2006/picture">
+                <pic:pic>
+                  <pic:nvPicPr>
+                    <pic:cNvPr id="0" name="shot_10_tool_log.png"/>
+                    <pic:cNvPicPr/>
+                  </pic:nvPicPr>
+                  <pic:blipFill>
+                    <a:blip r:embed="rId37"/>
+                    <a:stretch>
+                      <a:fillRect/>
+                    </a:stretch>
+                  </pic:blipFill>
+                  <pic:spPr>
+                    <a:xfrm>
+                      <a:off x="0" y="0"/>
+                      <a:ext cx="5486400" cy="5267175"/>
+                    </a:xfrm>
+                    <a:prstGeom prst="rect"/>
+                  </pic:spPr>
+                </pic:pic>
+              </a:graphicData>
+            </a:graphic>
+          </wp:inline>
+        </w:drawing>
+      </w:r>
+    </w:p>
+    <w:p>
+      <w:pPr>
+        <w:spacing w:after="160"/>
+        <w:jc w:val="center"/>
+      </w:pPr>
+      <w:r>
+        <w:rPr>
+          <w:rFonts w:ascii="Times New Roman" w:hAnsi="Times New Roman" w:eastAsia="宋体"/>
+          <w:b w:val="0"/>
+          <w:sz w:val="18"/>
+        </w:rPr>
+        <w:t>图 5-12 工具调用日志</w:t>
+      </w:r>
+    </w:p>
+    <w:p>
+      <w:pPr>
+        <w:spacing w:after="120" w:line="360" w:lineRule="auto"/>
+        <w:ind w:firstLine="420"/>
+      </w:pPr>
+      <w:r>
+        <w:rPr>
+          <w:rFonts w:ascii="Times New Roman" w:hAnsi="Times New Roman" w:eastAsia="宋体"/>
+          <w:b w:val="0"/>
+          <w:sz w:val="21"/>
+        </w:rPr>
+        <w:t>图 5-12 工具调用日志</w:t>
+      </w:r>
+    </w:p>
+    <w:p>
+      <w:pPr>
+        <w:jc w:val="center"/>
+      </w:pPr>
+      <w:r>
+        <w:drawing>
+          <wp:inline xmlns:a="http://schemas.openxmlformats.org/drawingml/2006/main" xmlns:pic="http://schemas.openxmlformats.org/drawingml/2006/picture">
+            <wp:extent cx="5486400" cy="1871388"/>
+            <wp:docPr id="23" name="Picture 23"/>
+            <wp:cNvGraphicFramePr>
+              <a:graphicFrameLocks noChangeAspect="1"/>
+            </wp:cNvGraphicFramePr>
+            <a:graphic>
+              <a:graphicData uri="http://schemas.openxmlformats.org/drawingml/2006/picture">
+                <pic:pic>
+                  <pic:nvPicPr>
+                    <pic:cNvPr id="0" name="shot_11_rag_result.png"/>
+                    <pic:cNvPicPr/>
+                  </pic:nvPicPr>
+                  <pic:blipFill>
+                    <a:blip r:embed="rId38"/>
+                    <a:stretch>
+                      <a:fillRect/>
+                    </a:stretch>
+                  </pic:blipFill>
+                  <pic:spPr>
+                    <a:xfrm>
+                      <a:off x="0" y="0"/>
+                      <a:ext cx="5486400" cy="1871388"/>
+                    </a:xfrm>
+                    <a:prstGeom prst="rect"/>
+                  </pic:spPr>
+                </pic:pic>
+              </a:graphicData>
+            </a:graphic>
+          </wp:inline>
+        </w:drawing>
+      </w:r>
+    </w:p>
+    <w:p>
+      <w:pPr>
+        <w:spacing w:after="160"/>
+        <w:jc w:val="center"/>
+      </w:pPr>
+      <w:r>
+        <w:rPr>
+          <w:rFonts w:ascii="Times New Roman" w:hAnsi="Times New Roman" w:eastAsia="宋体"/>
+          <w:b w:val="0"/>
+          <w:sz w:val="18"/>
+        </w:rPr>
+        <w:t>图 5-13 RAG 检索结果</w:t>
+      </w:r>
+    </w:p>
+    <w:p>
+      <w:pPr>
+        <w:spacing w:after="120" w:line="360" w:lineRule="auto"/>
+        <w:ind w:firstLine="420"/>
+      </w:pPr>
+      <w:r>
+        <w:rPr>
+          <w:rFonts w:ascii="Times New Roman" w:hAnsi="Times New Roman" w:eastAsia="宋体"/>
+          <w:b w:val="0"/>
+          <w:sz w:val="21"/>
+        </w:rPr>
+        <w:t>图 5-13 RAG 检索结果</w:t>
+      </w:r>
+    </w:p>
+    <w:p>
+      <w:pPr>
         <w:spacing w:after="120" w:line="360" w:lineRule="auto"/>
       </w:pPr>
       <w:r>
@@ -22846,7 +23033,7 @@
           <w:color w:val="555555"/>
           <w:sz w:val="18"/>
         </w:rPr>
-        <w:t>待补截图：工具调用日志和 RAG 检索结果。执行轨迹页面已见图 5-9。 - 工具调用日志：在项目根目录运行 python -m mcp_tools.demo，截取 cost_analyzer、decision_score、cooling_reminder 的调用输出；或打开后端 Swagger 调用 /api/tools/cost-analyzer 后截图。 - RAG 检索结果：运行 python rag/evaluate_rag.py 截取命中表格；或打开 RAG Swagger http://127.0.0.1:8001/docs，调用 POST /api/rag/search（case_type=shopping、query=想买降噪耳机、top_k=5）后截图返回结果。</w:t>
+        <w:t>待补截图（图 5-15）：pytest 实际运行结果。 运行方式：在项目根目录设置隔离数据库环境变量后执行 uv run --frozen pytest -p no:cacheprovider tests -q --tb=line --show-capture=no，截取命令和 292 passed, 5 failed ... 汇总行。 建议文件名：docs/report/assets/screenshots/shot_13_pytest.png。</w:t>
       </w:r>
     </w:p>
     <w:p>

</xml_diff>